<commit_message>
Update Word doc: lengkapi NIK/KK LOA ACC
</commit_message>
<xml_diff>
--- a/upload/Data_Riska_Ujang_TFL_IBUN.docx
+++ b/upload/Data_Riska_Ujang_TFL_IBUN.docx
@@ -7231,6 +7231,1098 @@
         <w:tc>
           <w:tcPr>
             <w:tcW w:type="dxa" w:w="340"/>
+            <w:shd w:fill="D4EDDA"/>
+          </w:tcPr>
+          <w:p>
+            <w:pPr>
+              <w:spacing w:before="20" w:after="20"/>
+              <w:jc w:val="center"/>
+            </w:pPr>
+            <w:r/>
+            <w:r>
+              <w:rPr>
+                <w:rFonts w:ascii="Calibri" w:hAnsi="Calibri"/>
+                <w:sz w:val="16"/>
+              </w:rPr>
+              <w:t>36</w:t>
+            </w:r>
+          </w:p>
+        </w:tc>
+        <w:tc>
+          <w:tcPr>
+            <w:tcW w:type="dxa" w:w="1247"/>
+            <w:shd w:fill="D4EDDA"/>
+          </w:tcPr>
+          <w:p>
+            <w:pPr>
+              <w:spacing w:before="20" w:after="20"/>
+              <w:jc w:val="left"/>
+            </w:pPr>
+            <w:r/>
+            <w:r>
+              <w:rPr>
+                <w:rFonts w:ascii="Calibri" w:hAnsi="Calibri"/>
+                <w:sz w:val="16"/>
+              </w:rPr>
+              <w:t>ASEP AAN SAEPUDIN</w:t>
+            </w:r>
+          </w:p>
+        </w:tc>
+        <w:tc>
+          <w:tcPr>
+            <w:tcW w:type="dxa" w:w="283"/>
+            <w:shd w:fill="D4EDDA"/>
+          </w:tcPr>
+          <w:p>
+            <w:pPr>
+              <w:spacing w:before="20" w:after="20"/>
+              <w:jc w:val="center"/>
+            </w:pPr>
+            <w:r/>
+            <w:r>
+              <w:rPr>
+                <w:rFonts w:ascii="Calibri" w:hAnsi="Calibri"/>
+                <w:sz w:val="16"/>
+              </w:rPr>
+              <w:t>L</w:t>
+            </w:r>
+          </w:p>
+        </w:tc>
+        <w:tc>
+          <w:tcPr>
+            <w:tcW w:type="dxa" w:w="1020"/>
+            <w:shd w:fill="D4EDDA"/>
+          </w:tcPr>
+          <w:p>
+            <w:pPr>
+              <w:spacing w:before="20" w:after="20"/>
+              <w:jc w:val="center"/>
+            </w:pPr>
+            <w:r/>
+            <w:r>
+              <w:rPr>
+                <w:rFonts w:ascii="Calibri" w:hAnsi="Calibri"/>
+                <w:sz w:val="16"/>
+              </w:rPr>
+              <w:t>3204350901750002</w:t>
+            </w:r>
+          </w:p>
+        </w:tc>
+        <w:tc>
+          <w:tcPr>
+            <w:tcW w:type="dxa" w:w="1020"/>
+            <w:shd w:fill="D4EDDA"/>
+          </w:tcPr>
+          <w:p>
+            <w:pPr>
+              <w:spacing w:before="20" w:after="20"/>
+              <w:jc w:val="center"/>
+            </w:pPr>
+            <w:r/>
+            <w:r>
+              <w:rPr>
+                <w:rFonts w:ascii="Calibri" w:hAnsi="Calibri"/>
+                <w:sz w:val="16"/>
+              </w:rPr>
+              <w:t>3204351208160008</w:t>
+            </w:r>
+          </w:p>
+        </w:tc>
+        <w:tc>
+          <w:tcPr>
+            <w:tcW w:type="dxa" w:w="1587"/>
+            <w:shd w:fill="D4EDDA"/>
+          </w:tcPr>
+          <w:p>
+            <w:pPr>
+              <w:spacing w:before="20" w:after="20"/>
+              <w:jc w:val="left"/>
+            </w:pPr>
+            <w:r/>
+            <w:r>
+              <w:rPr>
+                <w:rFonts w:ascii="Calibri" w:hAnsi="Calibri"/>
+                <w:sz w:val="16"/>
+              </w:rPr>
+              <w:t>KP LOA RT 01/01</w:t>
+            </w:r>
+          </w:p>
+        </w:tc>
+        <w:tc>
+          <w:tcPr>
+            <w:tcW w:type="dxa" w:w="567"/>
+            <w:shd w:fill="D4EDDA"/>
+          </w:tcPr>
+          <w:p>
+            <w:pPr>
+              <w:spacing w:before="20" w:after="20"/>
+              <w:jc w:val="center"/>
+            </w:pPr>
+            <w:r/>
+            <w:r>
+              <w:rPr>
+                <w:rFonts w:ascii="Calibri" w:hAnsi="Calibri"/>
+                <w:sz w:val="16"/>
+              </w:rPr>
+              <w:t>LOA</w:t>
+            </w:r>
+          </w:p>
+        </w:tc>
+        <w:tc>
+          <w:tcPr>
+            <w:tcW w:type="dxa" w:w="567"/>
+            <w:shd w:fill="D4EDDA"/>
+          </w:tcPr>
+          <w:p>
+            <w:pPr>
+              <w:spacing w:before="20" w:after="20"/>
+              <w:jc w:val="center"/>
+            </w:pPr>
+            <w:r/>
+            <w:r>
+              <w:rPr>
+                <w:rFonts w:ascii="Calibri" w:hAnsi="Calibri"/>
+                <w:sz w:val="16"/>
+              </w:rPr>
+              <w:t>PASEH</w:t>
+            </w:r>
+          </w:p>
+        </w:tc>
+        <w:tc>
+          <w:tcPr>
+            <w:tcW w:type="dxa" w:w="1020"/>
+            <w:shd w:fill="D4EDDA"/>
+          </w:tcPr>
+          <w:p>
+            <w:pPr>
+              <w:spacing w:before="20" w:after="20"/>
+              <w:jc w:val="left"/>
+            </w:pPr>
+            <w:r/>
+            <w:r>
+              <w:rPr>
+                <w:rFonts w:ascii="Calibri" w:hAnsi="Calibri"/>
+                <w:sz w:val="16"/>
+              </w:rPr>
+              <w:t>★ Data Pengganti</w:t>
+            </w:r>
+          </w:p>
+        </w:tc>
+      </w:tr>
+      <w:tr>
+        <w:tc>
+          <w:tcPr>
+            <w:tcW w:type="dxa" w:w="340"/>
+            <w:shd w:fill="D4EDDA"/>
+          </w:tcPr>
+          <w:p>
+            <w:pPr>
+              <w:spacing w:before="20" w:after="20"/>
+              <w:jc w:val="center"/>
+            </w:pPr>
+            <w:r/>
+            <w:r>
+              <w:rPr>
+                <w:rFonts w:ascii="Calibri" w:hAnsi="Calibri"/>
+                <w:sz w:val="16"/>
+              </w:rPr>
+              <w:t>37</w:t>
+            </w:r>
+          </w:p>
+        </w:tc>
+        <w:tc>
+          <w:tcPr>
+            <w:tcW w:type="dxa" w:w="1247"/>
+            <w:shd w:fill="D4EDDA"/>
+          </w:tcPr>
+          <w:p>
+            <w:pPr>
+              <w:spacing w:before="20" w:after="20"/>
+              <w:jc w:val="left"/>
+            </w:pPr>
+            <w:r/>
+            <w:r>
+              <w:rPr>
+                <w:rFonts w:ascii="Calibri" w:hAnsi="Calibri"/>
+                <w:sz w:val="16"/>
+              </w:rPr>
+              <w:t>DANA</w:t>
+            </w:r>
+          </w:p>
+        </w:tc>
+        <w:tc>
+          <w:tcPr>
+            <w:tcW w:type="dxa" w:w="283"/>
+            <w:shd w:fill="D4EDDA"/>
+          </w:tcPr>
+          <w:p>
+            <w:pPr>
+              <w:spacing w:before="20" w:after="20"/>
+              <w:jc w:val="center"/>
+            </w:pPr>
+            <w:r/>
+            <w:r>
+              <w:rPr>
+                <w:rFonts w:ascii="Calibri" w:hAnsi="Calibri"/>
+                <w:sz w:val="16"/>
+              </w:rPr>
+              <w:t>L</w:t>
+            </w:r>
+          </w:p>
+        </w:tc>
+        <w:tc>
+          <w:tcPr>
+            <w:tcW w:type="dxa" w:w="1020"/>
+            <w:shd w:fill="D4EDDA"/>
+          </w:tcPr>
+          <w:p>
+            <w:pPr>
+              <w:spacing w:before="20" w:after="20"/>
+              <w:jc w:val="center"/>
+            </w:pPr>
+            <w:r/>
+            <w:r>
+              <w:rPr>
+                <w:rFonts w:ascii="Calibri" w:hAnsi="Calibri"/>
+                <w:sz w:val="16"/>
+              </w:rPr>
+              <w:t>3204352610750003</w:t>
+            </w:r>
+          </w:p>
+        </w:tc>
+        <w:tc>
+          <w:tcPr>
+            <w:tcW w:type="dxa" w:w="1020"/>
+            <w:shd w:fill="D4EDDA"/>
+          </w:tcPr>
+          <w:p>
+            <w:pPr>
+              <w:spacing w:before="20" w:after="20"/>
+              <w:jc w:val="center"/>
+            </w:pPr>
+            <w:r/>
+            <w:r>
+              <w:rPr>
+                <w:rFonts w:ascii="Calibri" w:hAnsi="Calibri"/>
+                <w:sz w:val="16"/>
+              </w:rPr>
+              <w:t>3204351903051537</w:t>
+            </w:r>
+          </w:p>
+        </w:tc>
+        <w:tc>
+          <w:tcPr>
+            <w:tcW w:type="dxa" w:w="1587"/>
+            <w:shd w:fill="D4EDDA"/>
+          </w:tcPr>
+          <w:p>
+            <w:pPr>
+              <w:spacing w:before="20" w:after="20"/>
+              <w:jc w:val="left"/>
+            </w:pPr>
+            <w:r/>
+            <w:r>
+              <w:rPr>
+                <w:rFonts w:ascii="Calibri" w:hAnsi="Calibri"/>
+                <w:sz w:val="16"/>
+              </w:rPr>
+              <w:t>KP SUKA GEUNAH RT 01/05</w:t>
+            </w:r>
+          </w:p>
+        </w:tc>
+        <w:tc>
+          <w:tcPr>
+            <w:tcW w:type="dxa" w:w="567"/>
+            <w:shd w:fill="D4EDDA"/>
+          </w:tcPr>
+          <w:p>
+            <w:pPr>
+              <w:spacing w:before="20" w:after="20"/>
+              <w:jc w:val="center"/>
+            </w:pPr>
+            <w:r/>
+            <w:r>
+              <w:rPr>
+                <w:rFonts w:ascii="Calibri" w:hAnsi="Calibri"/>
+                <w:sz w:val="16"/>
+              </w:rPr>
+              <w:t>LOA</w:t>
+            </w:r>
+          </w:p>
+        </w:tc>
+        <w:tc>
+          <w:tcPr>
+            <w:tcW w:type="dxa" w:w="567"/>
+            <w:shd w:fill="D4EDDA"/>
+          </w:tcPr>
+          <w:p>
+            <w:pPr>
+              <w:spacing w:before="20" w:after="20"/>
+              <w:jc w:val="center"/>
+            </w:pPr>
+            <w:r/>
+            <w:r>
+              <w:rPr>
+                <w:rFonts w:ascii="Calibri" w:hAnsi="Calibri"/>
+                <w:sz w:val="16"/>
+              </w:rPr>
+              <w:t>PASEH</w:t>
+            </w:r>
+          </w:p>
+        </w:tc>
+        <w:tc>
+          <w:tcPr>
+            <w:tcW w:type="dxa" w:w="1020"/>
+            <w:shd w:fill="D4EDDA"/>
+          </w:tcPr>
+          <w:p>
+            <w:pPr>
+              <w:spacing w:before="20" w:after="20"/>
+              <w:jc w:val="left"/>
+            </w:pPr>
+            <w:r/>
+            <w:r>
+              <w:rPr>
+                <w:rFonts w:ascii="Calibri" w:hAnsi="Calibri"/>
+                <w:sz w:val="16"/>
+              </w:rPr>
+              <w:t>★ Data Pengganti</w:t>
+            </w:r>
+          </w:p>
+        </w:tc>
+      </w:tr>
+      <w:tr>
+        <w:tc>
+          <w:tcPr>
+            <w:tcW w:type="dxa" w:w="340"/>
+            <w:shd w:fill="D4EDDA"/>
+          </w:tcPr>
+          <w:p>
+            <w:pPr>
+              <w:spacing w:before="20" w:after="20"/>
+              <w:jc w:val="center"/>
+            </w:pPr>
+            <w:r/>
+            <w:r>
+              <w:rPr>
+                <w:rFonts w:ascii="Calibri" w:hAnsi="Calibri"/>
+                <w:sz w:val="16"/>
+              </w:rPr>
+              <w:t>38</w:t>
+            </w:r>
+          </w:p>
+        </w:tc>
+        <w:tc>
+          <w:tcPr>
+            <w:tcW w:type="dxa" w:w="1247"/>
+            <w:shd w:fill="D4EDDA"/>
+          </w:tcPr>
+          <w:p>
+            <w:pPr>
+              <w:spacing w:before="20" w:after="20"/>
+              <w:jc w:val="left"/>
+            </w:pPr>
+            <w:r/>
+            <w:r>
+              <w:rPr>
+                <w:rFonts w:ascii="Calibri" w:hAnsi="Calibri"/>
+                <w:sz w:val="16"/>
+              </w:rPr>
+              <w:t>NURHAYATI</w:t>
+            </w:r>
+          </w:p>
+        </w:tc>
+        <w:tc>
+          <w:tcPr>
+            <w:tcW w:type="dxa" w:w="283"/>
+            <w:shd w:fill="D4EDDA"/>
+          </w:tcPr>
+          <w:p>
+            <w:pPr>
+              <w:spacing w:before="20" w:after="20"/>
+              <w:jc w:val="center"/>
+            </w:pPr>
+            <w:r/>
+            <w:r>
+              <w:rPr>
+                <w:rFonts w:ascii="Calibri" w:hAnsi="Calibri"/>
+                <w:sz w:val="16"/>
+              </w:rPr>
+              <w:t>P</w:t>
+            </w:r>
+          </w:p>
+        </w:tc>
+        <w:tc>
+          <w:tcPr>
+            <w:tcW w:type="dxa" w:w="1020"/>
+            <w:shd w:fill="D4EDDA"/>
+          </w:tcPr>
+          <w:p>
+            <w:pPr>
+              <w:spacing w:before="20" w:after="20"/>
+              <w:jc w:val="center"/>
+            </w:pPr>
+            <w:r/>
+            <w:r>
+              <w:rPr>
+                <w:rFonts w:ascii="Calibri" w:hAnsi="Calibri"/>
+                <w:sz w:val="16"/>
+              </w:rPr>
+              <w:t>3204354805770008</w:t>
+            </w:r>
+          </w:p>
+        </w:tc>
+        <w:tc>
+          <w:tcPr>
+            <w:tcW w:type="dxa" w:w="1020"/>
+            <w:shd w:fill="D4EDDA"/>
+          </w:tcPr>
+          <w:p>
+            <w:pPr>
+              <w:spacing w:before="20" w:after="20"/>
+              <w:jc w:val="center"/>
+            </w:pPr>
+            <w:r/>
+            <w:r>
+              <w:rPr>
+                <w:rFonts w:ascii="Calibri" w:hAnsi="Calibri"/>
+                <w:sz w:val="16"/>
+              </w:rPr>
+              <w:t>3204351903050323</w:t>
+            </w:r>
+          </w:p>
+        </w:tc>
+        <w:tc>
+          <w:tcPr>
+            <w:tcW w:type="dxa" w:w="1587"/>
+            <w:shd w:fill="D4EDDA"/>
+          </w:tcPr>
+          <w:p>
+            <w:pPr>
+              <w:spacing w:before="20" w:after="20"/>
+              <w:jc w:val="left"/>
+            </w:pPr>
+            <w:r/>
+            <w:r>
+              <w:rPr>
+                <w:rFonts w:ascii="Calibri" w:hAnsi="Calibri"/>
+                <w:sz w:val="16"/>
+              </w:rPr>
+              <w:t>KP CILOPANG RT 02 RW 07</w:t>
+            </w:r>
+          </w:p>
+        </w:tc>
+        <w:tc>
+          <w:tcPr>
+            <w:tcW w:type="dxa" w:w="567"/>
+            <w:shd w:fill="D4EDDA"/>
+          </w:tcPr>
+          <w:p>
+            <w:pPr>
+              <w:spacing w:before="20" w:after="20"/>
+              <w:jc w:val="center"/>
+            </w:pPr>
+            <w:r/>
+            <w:r>
+              <w:rPr>
+                <w:rFonts w:ascii="Calibri" w:hAnsi="Calibri"/>
+                <w:sz w:val="16"/>
+              </w:rPr>
+              <w:t>LOA</w:t>
+            </w:r>
+          </w:p>
+        </w:tc>
+        <w:tc>
+          <w:tcPr>
+            <w:tcW w:type="dxa" w:w="567"/>
+            <w:shd w:fill="D4EDDA"/>
+          </w:tcPr>
+          <w:p>
+            <w:pPr>
+              <w:spacing w:before="20" w:after="20"/>
+              <w:jc w:val="center"/>
+            </w:pPr>
+            <w:r/>
+            <w:r>
+              <w:rPr>
+                <w:rFonts w:ascii="Calibri" w:hAnsi="Calibri"/>
+                <w:sz w:val="16"/>
+              </w:rPr>
+              <w:t>PASEH</w:t>
+            </w:r>
+          </w:p>
+        </w:tc>
+        <w:tc>
+          <w:tcPr>
+            <w:tcW w:type="dxa" w:w="1020"/>
+            <w:shd w:fill="D4EDDA"/>
+          </w:tcPr>
+          <w:p>
+            <w:pPr>
+              <w:spacing w:before="20" w:after="20"/>
+              <w:jc w:val="left"/>
+            </w:pPr>
+            <w:r/>
+            <w:r>
+              <w:rPr>
+                <w:rFonts w:ascii="Calibri" w:hAnsi="Calibri"/>
+                <w:sz w:val="16"/>
+              </w:rPr>
+              <w:t>★ Data Pengganti</w:t>
+            </w:r>
+          </w:p>
+        </w:tc>
+      </w:tr>
+      <w:tr>
+        <w:tc>
+          <w:tcPr>
+            <w:tcW w:type="dxa" w:w="340"/>
+            <w:shd w:fill="D4EDDA"/>
+          </w:tcPr>
+          <w:p>
+            <w:pPr>
+              <w:spacing w:before="20" w:after="20"/>
+              <w:jc w:val="center"/>
+            </w:pPr>
+            <w:r/>
+            <w:r>
+              <w:rPr>
+                <w:rFonts w:ascii="Calibri" w:hAnsi="Calibri"/>
+                <w:sz w:val="16"/>
+              </w:rPr>
+              <w:t>39</w:t>
+            </w:r>
+          </w:p>
+        </w:tc>
+        <w:tc>
+          <w:tcPr>
+            <w:tcW w:type="dxa" w:w="1247"/>
+            <w:shd w:fill="D4EDDA"/>
+          </w:tcPr>
+          <w:p>
+            <w:pPr>
+              <w:spacing w:before="20" w:after="20"/>
+              <w:jc w:val="left"/>
+            </w:pPr>
+            <w:r/>
+            <w:r>
+              <w:rPr>
+                <w:rFonts w:ascii="Calibri" w:hAnsi="Calibri"/>
+                <w:sz w:val="16"/>
+              </w:rPr>
+              <w:t>TARLAN</w:t>
+            </w:r>
+          </w:p>
+        </w:tc>
+        <w:tc>
+          <w:tcPr>
+            <w:tcW w:type="dxa" w:w="283"/>
+            <w:shd w:fill="D4EDDA"/>
+          </w:tcPr>
+          <w:p>
+            <w:pPr>
+              <w:spacing w:before="20" w:after="20"/>
+              <w:jc w:val="center"/>
+            </w:pPr>
+            <w:r/>
+            <w:r>
+              <w:rPr>
+                <w:rFonts w:ascii="Calibri" w:hAnsi="Calibri"/>
+                <w:sz w:val="16"/>
+              </w:rPr>
+              <w:t>L</w:t>
+            </w:r>
+          </w:p>
+        </w:tc>
+        <w:tc>
+          <w:tcPr>
+            <w:tcW w:type="dxa" w:w="1020"/>
+            <w:shd w:fill="D4EDDA"/>
+          </w:tcPr>
+          <w:p>
+            <w:pPr>
+              <w:spacing w:before="20" w:after="20"/>
+              <w:jc w:val="center"/>
+            </w:pPr>
+            <w:r/>
+            <w:r>
+              <w:rPr>
+                <w:rFonts w:ascii="Calibri" w:hAnsi="Calibri"/>
+                <w:sz w:val="16"/>
+              </w:rPr>
+              <w:t>3204351808630003</w:t>
+            </w:r>
+          </w:p>
+        </w:tc>
+        <w:tc>
+          <w:tcPr>
+            <w:tcW w:type="dxa" w:w="1020"/>
+            <w:shd w:fill="D4EDDA"/>
+          </w:tcPr>
+          <w:p>
+            <w:pPr>
+              <w:spacing w:before="20" w:after="20"/>
+              <w:jc w:val="center"/>
+            </w:pPr>
+            <w:r/>
+            <w:r>
+              <w:rPr>
+                <w:rFonts w:ascii="Calibri" w:hAnsi="Calibri"/>
+                <w:sz w:val="16"/>
+              </w:rPr>
+              <w:t>3204352405110065</w:t>
+            </w:r>
+          </w:p>
+        </w:tc>
+        <w:tc>
+          <w:tcPr>
+            <w:tcW w:type="dxa" w:w="1587"/>
+            <w:shd w:fill="D4EDDA"/>
+          </w:tcPr>
+          <w:p>
+            <w:pPr>
+              <w:spacing w:before="20" w:after="20"/>
+              <w:jc w:val="left"/>
+            </w:pPr>
+            <w:r/>
+            <w:r>
+              <w:rPr>
+                <w:rFonts w:ascii="Calibri" w:hAnsi="Calibri"/>
+                <w:sz w:val="16"/>
+              </w:rPr>
+              <w:t>KP CILOPANG RT 04/07</w:t>
+            </w:r>
+          </w:p>
+        </w:tc>
+        <w:tc>
+          <w:tcPr>
+            <w:tcW w:type="dxa" w:w="567"/>
+            <w:shd w:fill="D4EDDA"/>
+          </w:tcPr>
+          <w:p>
+            <w:pPr>
+              <w:spacing w:before="20" w:after="20"/>
+              <w:jc w:val="center"/>
+            </w:pPr>
+            <w:r/>
+            <w:r>
+              <w:rPr>
+                <w:rFonts w:ascii="Calibri" w:hAnsi="Calibri"/>
+                <w:sz w:val="16"/>
+              </w:rPr>
+              <w:t>LOA</w:t>
+            </w:r>
+          </w:p>
+        </w:tc>
+        <w:tc>
+          <w:tcPr>
+            <w:tcW w:type="dxa" w:w="567"/>
+            <w:shd w:fill="D4EDDA"/>
+          </w:tcPr>
+          <w:p>
+            <w:pPr>
+              <w:spacing w:before="20" w:after="20"/>
+              <w:jc w:val="center"/>
+            </w:pPr>
+            <w:r/>
+            <w:r>
+              <w:rPr>
+                <w:rFonts w:ascii="Calibri" w:hAnsi="Calibri"/>
+                <w:sz w:val="16"/>
+              </w:rPr>
+              <w:t>PASEH</w:t>
+            </w:r>
+          </w:p>
+        </w:tc>
+        <w:tc>
+          <w:tcPr>
+            <w:tcW w:type="dxa" w:w="1020"/>
+            <w:shd w:fill="D4EDDA"/>
+          </w:tcPr>
+          <w:p>
+            <w:pPr>
+              <w:spacing w:before="20" w:after="20"/>
+              <w:jc w:val="left"/>
+            </w:pPr>
+            <w:r/>
+            <w:r>
+              <w:rPr>
+                <w:rFonts w:ascii="Calibri" w:hAnsi="Calibri"/>
+                <w:sz w:val="16"/>
+              </w:rPr>
+              <w:t>★ Data Pengganti</w:t>
+            </w:r>
+          </w:p>
+        </w:tc>
+      </w:tr>
+      <w:tr>
+        <w:tc>
+          <w:tcPr>
+            <w:tcW w:type="dxa" w:w="340"/>
+            <w:shd w:fill="D4EDDA"/>
+          </w:tcPr>
+          <w:p>
+            <w:pPr>
+              <w:spacing w:before="20" w:after="20"/>
+              <w:jc w:val="center"/>
+            </w:pPr>
+            <w:r/>
+            <w:r>
+              <w:rPr>
+                <w:rFonts w:ascii="Calibri" w:hAnsi="Calibri"/>
+                <w:sz w:val="16"/>
+              </w:rPr>
+              <w:t>40</w:t>
+            </w:r>
+          </w:p>
+        </w:tc>
+        <w:tc>
+          <w:tcPr>
+            <w:tcW w:type="dxa" w:w="1247"/>
+            <w:shd w:fill="D4EDDA"/>
+          </w:tcPr>
+          <w:p>
+            <w:pPr>
+              <w:spacing w:before="20" w:after="20"/>
+              <w:jc w:val="left"/>
+            </w:pPr>
+            <w:r/>
+            <w:r>
+              <w:rPr>
+                <w:rFonts w:ascii="Calibri" w:hAnsi="Calibri"/>
+                <w:sz w:val="16"/>
+              </w:rPr>
+              <w:t>ICAH</w:t>
+            </w:r>
+          </w:p>
+        </w:tc>
+        <w:tc>
+          <w:tcPr>
+            <w:tcW w:type="dxa" w:w="283"/>
+            <w:shd w:fill="D4EDDA"/>
+          </w:tcPr>
+          <w:p>
+            <w:pPr>
+              <w:spacing w:before="20" w:after="20"/>
+              <w:jc w:val="center"/>
+            </w:pPr>
+            <w:r/>
+            <w:r>
+              <w:rPr>
+                <w:rFonts w:ascii="Calibri" w:hAnsi="Calibri"/>
+                <w:sz w:val="16"/>
+              </w:rPr>
+              <w:t>P</w:t>
+            </w:r>
+          </w:p>
+        </w:tc>
+        <w:tc>
+          <w:tcPr>
+            <w:tcW w:type="dxa" w:w="1020"/>
+            <w:shd w:fill="D4EDDA"/>
+          </w:tcPr>
+          <w:p>
+            <w:pPr>
+              <w:spacing w:before="20" w:after="20"/>
+              <w:jc w:val="center"/>
+            </w:pPr>
+            <w:r/>
+            <w:r>
+              <w:rPr>
+                <w:rFonts w:ascii="Calibri" w:hAnsi="Calibri"/>
+                <w:sz w:val="16"/>
+              </w:rPr>
+              <w:t>3204354107710061</w:t>
+            </w:r>
+          </w:p>
+        </w:tc>
+        <w:tc>
+          <w:tcPr>
+            <w:tcW w:type="dxa" w:w="1020"/>
+            <w:shd w:fill="D4EDDA"/>
+          </w:tcPr>
+          <w:p>
+            <w:pPr>
+              <w:spacing w:before="20" w:after="20"/>
+              <w:jc w:val="center"/>
+            </w:pPr>
+            <w:r/>
+            <w:r>
+              <w:rPr>
+                <w:rFonts w:ascii="Calibri" w:hAnsi="Calibri"/>
+                <w:sz w:val="16"/>
+              </w:rPr>
+              <w:t>3204352304200006</w:t>
+            </w:r>
+          </w:p>
+        </w:tc>
+        <w:tc>
+          <w:tcPr>
+            <w:tcW w:type="dxa" w:w="1587"/>
+            <w:shd w:fill="D4EDDA"/>
+          </w:tcPr>
+          <w:p>
+            <w:pPr>
+              <w:spacing w:before="20" w:after="20"/>
+              <w:jc w:val="left"/>
+            </w:pPr>
+            <w:r/>
+            <w:r>
+              <w:rPr>
+                <w:rFonts w:ascii="Calibri" w:hAnsi="Calibri"/>
+                <w:sz w:val="16"/>
+              </w:rPr>
+              <w:t>Sempak RT 003 RW 005</w:t>
+            </w:r>
+          </w:p>
+        </w:tc>
+        <w:tc>
+          <w:tcPr>
+            <w:tcW w:type="dxa" w:w="567"/>
+            <w:shd w:fill="D4EDDA"/>
+          </w:tcPr>
+          <w:p>
+            <w:pPr>
+              <w:spacing w:before="20" w:after="20"/>
+              <w:jc w:val="center"/>
+            </w:pPr>
+            <w:r/>
+            <w:r>
+              <w:rPr>
+                <w:rFonts w:ascii="Calibri" w:hAnsi="Calibri"/>
+                <w:sz w:val="16"/>
+              </w:rPr>
+              <w:t>LOA</w:t>
+            </w:r>
+          </w:p>
+        </w:tc>
+        <w:tc>
+          <w:tcPr>
+            <w:tcW w:type="dxa" w:w="567"/>
+            <w:shd w:fill="D4EDDA"/>
+          </w:tcPr>
+          <w:p>
+            <w:pPr>
+              <w:spacing w:before="20" w:after="20"/>
+              <w:jc w:val="center"/>
+            </w:pPr>
+            <w:r/>
+            <w:r>
+              <w:rPr>
+                <w:rFonts w:ascii="Calibri" w:hAnsi="Calibri"/>
+                <w:sz w:val="16"/>
+              </w:rPr>
+              <w:t>PASEH</w:t>
+            </w:r>
+          </w:p>
+        </w:tc>
+        <w:tc>
+          <w:tcPr>
+            <w:tcW w:type="dxa" w:w="1020"/>
+            <w:shd w:fill="D4EDDA"/>
+          </w:tcPr>
+          <w:p>
+            <w:pPr>
+              <w:spacing w:before="20" w:after="20"/>
+              <w:jc w:val="left"/>
+            </w:pPr>
+            <w:r/>
+            <w:r>
+              <w:rPr>
+                <w:rFonts w:ascii="Calibri" w:hAnsi="Calibri"/>
+                <w:sz w:val="16"/>
+              </w:rPr>
+              <w:t>★ Data Pengganti</w:t>
+            </w:r>
+          </w:p>
+        </w:tc>
+      </w:tr>
+      <w:tr>
+        <w:tc>
+          <w:tcPr>
+            <w:tcW w:type="dxa" w:w="340"/>
+            <w:shd w:fill="FFFFFF"/>
+          </w:tcPr>
+          <w:p>
+            <w:pPr>
+              <w:spacing w:before="20" w:after="20"/>
+              <w:jc w:val="center"/>
+            </w:pPr>
+            <w:r/>
+            <w:r>
+              <w:rPr>
+                <w:rFonts w:ascii="Calibri" w:hAnsi="Calibri"/>
+                <w:sz w:val="16"/>
+              </w:rPr>
+              <w:t>41</w:t>
+            </w:r>
+          </w:p>
+        </w:tc>
+        <w:tc>
+          <w:tcPr>
+            <w:tcW w:type="dxa" w:w="1247"/>
+            <w:shd w:fill="FFFFFF"/>
+          </w:tcPr>
+          <w:p>
+            <w:pPr>
+              <w:spacing w:before="20" w:after="20"/>
+              <w:jc w:val="left"/>
+            </w:pPr>
+            <w:r/>
+            <w:r>
+              <w:rPr>
+                <w:rFonts w:ascii="Calibri" w:hAnsi="Calibri"/>
+                <w:sz w:val="16"/>
+              </w:rPr>
+              <w:t>ADANG</w:t>
+            </w:r>
+          </w:p>
+        </w:tc>
+        <w:tc>
+          <w:tcPr>
+            <w:tcW w:type="dxa" w:w="283"/>
+            <w:shd w:fill="FFFFFF"/>
+          </w:tcPr>
+          <w:p>
+            <w:pPr>
+              <w:spacing w:before="20" w:after="20"/>
+              <w:jc w:val="center"/>
+            </w:pPr>
+            <w:r/>
+            <w:r>
+              <w:rPr>
+                <w:rFonts w:ascii="Calibri" w:hAnsi="Calibri"/>
+                <w:sz w:val="16"/>
+              </w:rPr>
+              <w:t>P</w:t>
+            </w:r>
+          </w:p>
+        </w:tc>
+        <w:tc>
+          <w:tcPr>
+            <w:tcW w:type="dxa" w:w="1020"/>
+            <w:shd w:fill="FFFFFF"/>
+          </w:tcPr>
+          <w:p>
+            <w:pPr>
+              <w:spacing w:before="20" w:after="20"/>
+              <w:jc w:val="center"/>
+            </w:pPr>
+            <w:r/>
+            <w:r>
+              <w:rPr>
+                <w:rFonts w:ascii="Calibri" w:hAnsi="Calibri"/>
+                <w:sz w:val="16"/>
+              </w:rPr>
+              <w:t>3204364406880002</w:t>
+            </w:r>
+          </w:p>
+        </w:tc>
+        <w:tc>
+          <w:tcPr>
+            <w:tcW w:type="dxa" w:w="1020"/>
+            <w:shd w:fill="FFFFFF"/>
+          </w:tcPr>
+          <w:p>
+            <w:pPr>
+              <w:spacing w:before="20" w:after="20"/>
+              <w:jc w:val="center"/>
+            </w:pPr>
+            <w:r/>
+            <w:r>
+              <w:rPr>
+                <w:rFonts w:ascii="Calibri" w:hAnsi="Calibri"/>
+                <w:sz w:val="16"/>
+              </w:rPr>
+              <w:t>3204361108120039</w:t>
+            </w:r>
+          </w:p>
+        </w:tc>
+        <w:tc>
+          <w:tcPr>
+            <w:tcW w:type="dxa" w:w="1587"/>
+            <w:shd w:fill="FFFFFF"/>
+          </w:tcPr>
+          <w:p>
+            <w:pPr>
+              <w:spacing w:before="20" w:after="20"/>
+              <w:jc w:val="left"/>
+            </w:pPr>
+            <w:r/>
+            <w:r>
+              <w:rPr>
+                <w:rFonts w:ascii="Calibri" w:hAnsi="Calibri"/>
+                <w:sz w:val="16"/>
+              </w:rPr>
+              <w:t>KP CICANAR RT 1 RW 12</w:t>
+            </w:r>
+          </w:p>
+        </w:tc>
+        <w:tc>
+          <w:tcPr>
+            <w:tcW w:type="dxa" w:w="567"/>
+            <w:shd w:fill="FFFFFF"/>
+          </w:tcPr>
+          <w:p>
+            <w:pPr>
+              <w:spacing w:before="20" w:after="20"/>
+              <w:jc w:val="center"/>
+            </w:pPr>
+            <w:r/>
+            <w:r>
+              <w:rPr>
+                <w:rFonts w:ascii="Calibri" w:hAnsi="Calibri"/>
+                <w:sz w:val="16"/>
+              </w:rPr>
+              <w:t>LOA</w:t>
+            </w:r>
+          </w:p>
+        </w:tc>
+        <w:tc>
+          <w:tcPr>
+            <w:tcW w:type="dxa" w:w="567"/>
+            <w:shd w:fill="FFFFFF"/>
+          </w:tcPr>
+          <w:p>
+            <w:pPr>
+              <w:spacing w:before="20" w:after="20"/>
+              <w:jc w:val="center"/>
+            </w:pPr>
+            <w:r/>
+            <w:r>
+              <w:rPr>
+                <w:rFonts w:ascii="Calibri" w:hAnsi="Calibri"/>
+                <w:sz w:val="16"/>
+              </w:rPr>
+              <w:t>PASEH</w:t>
+            </w:r>
+          </w:p>
+        </w:tc>
+        <w:tc>
+          <w:tcPr>
+            <w:tcW w:type="dxa" w:w="1020"/>
+            <w:shd w:fill="FFFFFF"/>
+          </w:tcPr>
+          <w:p>
+            <w:pPr>
+              <w:spacing w:before="20" w:after="20"/>
+              <w:jc w:val="left"/>
+            </w:pPr>
+            <w:r/>
+            <w:r>
+              <w:rPr>
+                <w:rFonts w:ascii="Calibri" w:hAnsi="Calibri"/>
+                <w:sz w:val="16"/>
+              </w:rPr>
+              <w:t>ACC</w:t>
+            </w:r>
+          </w:p>
+        </w:tc>
+      </w:tr>
+      <w:tr>
+        <w:tc>
+          <w:tcPr>
+            <w:tcW w:type="dxa" w:w="340"/>
             <w:shd w:fill="E7E4DF"/>
           </w:tcPr>
           <w:p>
@@ -7244,7 +8336,7 @@
                 <w:rFonts w:ascii="Calibri" w:hAnsi="Calibri"/>
                 <w:sz w:val="16"/>
               </w:rPr>
-              <w:t>36</w:t>
+              <w:t>42</w:t>
             </w:r>
           </w:p>
         </w:tc>
@@ -7264,7 +8356,7 @@
                 <w:rFonts w:ascii="Calibri" w:hAnsi="Calibri"/>
                 <w:sz w:val="16"/>
               </w:rPr>
-              <w:t>ASEP AAN SAEPUDIN</w:t>
+              <w:t>ADE</w:t>
             </w:r>
           </w:p>
         </w:tc>
@@ -7304,7 +8396,7 @@
                 <w:rFonts w:ascii="Calibri" w:hAnsi="Calibri"/>
                 <w:sz w:val="16"/>
               </w:rPr>
-              <w:t>3204350901750002</w:t>
+              <w:t>3204351205630001</w:t>
             </w:r>
           </w:p>
         </w:tc>
@@ -7324,7 +8416,7 @@
                 <w:rFonts w:ascii="Calibri" w:hAnsi="Calibri"/>
                 <w:sz w:val="16"/>
               </w:rPr>
-              <w:t>3204351208160008</w:t>
+              <w:t>3204351903050814</w:t>
             </w:r>
           </w:p>
         </w:tc>
@@ -7344,7 +8436,7 @@
                 <w:rFonts w:ascii="Calibri" w:hAnsi="Calibri"/>
                 <w:sz w:val="16"/>
               </w:rPr>
-              <w:t>KP LOA RT 01/01</w:t>
+              <w:t>KP MALANG RT 5 RW 6</w:t>
             </w:r>
           </w:p>
         </w:tc>
@@ -7426,7 +8518,7 @@
                 <w:rFonts w:ascii="Calibri" w:hAnsi="Calibri"/>
                 <w:sz w:val="16"/>
               </w:rPr>
-              <w:t>37</w:t>
+              <w:t>43</w:t>
             </w:r>
           </w:p>
         </w:tc>
@@ -7446,7 +8538,7 @@
                 <w:rFonts w:ascii="Calibri" w:hAnsi="Calibri"/>
                 <w:sz w:val="16"/>
               </w:rPr>
-              <w:t>DANA</w:t>
+              <w:t>ANAH</w:t>
             </w:r>
           </w:p>
         </w:tc>
@@ -7466,7 +8558,7 @@
                 <w:rFonts w:ascii="Calibri" w:hAnsi="Calibri"/>
                 <w:sz w:val="16"/>
               </w:rPr>
-              <w:t>L</w:t>
+              <w:t>P</w:t>
             </w:r>
           </w:p>
         </w:tc>
@@ -7486,7 +8578,7 @@
                 <w:rFonts w:ascii="Calibri" w:hAnsi="Calibri"/>
                 <w:sz w:val="16"/>
               </w:rPr>
-              <w:t>3204352610750003</w:t>
+              <w:t>3204354304480004</w:t>
             </w:r>
           </w:p>
         </w:tc>
@@ -7506,7 +8598,7 @@
                 <w:rFonts w:ascii="Calibri" w:hAnsi="Calibri"/>
                 <w:sz w:val="16"/>
               </w:rPr>
-              <w:t>3204351903051537</w:t>
+              <w:t>3204352201200003</w:t>
             </w:r>
           </w:p>
         </w:tc>
@@ -7526,7 +8618,7 @@
                 <w:rFonts w:ascii="Calibri" w:hAnsi="Calibri"/>
                 <w:sz w:val="16"/>
               </w:rPr>
-              <w:t>KP SUKA GEUNAH RT 01/05</w:t>
+              <w:t>KP NENGENG RT 2 RW 4</w:t>
             </w:r>
           </w:p>
         </w:tc>
@@ -7608,7 +8700,7 @@
                 <w:rFonts w:ascii="Calibri" w:hAnsi="Calibri"/>
                 <w:sz w:val="16"/>
               </w:rPr>
-              <w:t>38</w:t>
+              <w:t>44</w:t>
             </w:r>
           </w:p>
         </w:tc>
@@ -7628,7 +8720,7 @@
                 <w:rFonts w:ascii="Calibri" w:hAnsi="Calibri"/>
                 <w:sz w:val="16"/>
               </w:rPr>
-              <w:t>NURHAYATI</w:t>
+              <w:t>WAHYU WIBISANA</w:t>
             </w:r>
           </w:p>
         </w:tc>
@@ -7648,7 +8740,7 @@
                 <w:rFonts w:ascii="Calibri" w:hAnsi="Calibri"/>
                 <w:sz w:val="16"/>
               </w:rPr>
-              <w:t>P</w:t>
+              <w:t>L</w:t>
             </w:r>
           </w:p>
         </w:tc>
@@ -7668,7 +8760,7 @@
                 <w:rFonts w:ascii="Calibri" w:hAnsi="Calibri"/>
                 <w:sz w:val="16"/>
               </w:rPr>
-              <w:t>3204354805770008</w:t>
+              <w:t>3204353112600001</w:t>
             </w:r>
           </w:p>
         </w:tc>
@@ -7688,7 +8780,7 @@
                 <w:rFonts w:ascii="Calibri" w:hAnsi="Calibri"/>
                 <w:sz w:val="16"/>
               </w:rPr>
-              <w:t>3204351903050323</w:t>
+              <w:t>3204350701060146</w:t>
             </w:r>
           </w:p>
         </w:tc>
@@ -7708,7 +8800,7 @@
                 <w:rFonts w:ascii="Calibri" w:hAnsi="Calibri"/>
                 <w:sz w:val="16"/>
               </w:rPr>
-              <w:t>KP CILOPANG RT 02 RW 07</w:t>
+              <w:t>LIMUS MANGGUNG RT 3 RW 8</w:t>
             </w:r>
           </w:p>
         </w:tc>
@@ -7777,27 +8869,27 @@
         <w:tc>
           <w:tcPr>
             <w:tcW w:type="dxa" w:w="340"/>
-            <w:shd w:fill="FFFFFF"/>
-          </w:tcPr>
-          <w:p>
-            <w:pPr>
-              <w:spacing w:before="20" w:after="20"/>
-              <w:jc w:val="center"/>
-            </w:pPr>
-            <w:r/>
-            <w:r>
-              <w:rPr>
-                <w:rFonts w:ascii="Calibri" w:hAnsi="Calibri"/>
-                <w:sz w:val="16"/>
-              </w:rPr>
-              <w:t>39</w:t>
+            <w:shd w:fill="D4EDDA"/>
+          </w:tcPr>
+          <w:p>
+            <w:pPr>
+              <w:spacing w:before="20" w:after="20"/>
+              <w:jc w:val="center"/>
+            </w:pPr>
+            <w:r/>
+            <w:r>
+              <w:rPr>
+                <w:rFonts w:ascii="Calibri" w:hAnsi="Calibri"/>
+                <w:sz w:val="16"/>
+              </w:rPr>
+              <w:t>45</w:t>
             </w:r>
           </w:p>
         </w:tc>
         <w:tc>
           <w:tcPr>
             <w:tcW w:type="dxa" w:w="1247"/>
-            <w:shd w:fill="FFFFFF"/>
+            <w:shd w:fill="D4EDDA"/>
           </w:tcPr>
           <w:p>
             <w:pPr>
@@ -7810,74 +8902,74 @@
                 <w:rFonts w:ascii="Calibri" w:hAnsi="Calibri"/>
                 <w:sz w:val="16"/>
               </w:rPr>
-              <w:t>TARLAN</w:t>
+              <w:t>ECIN</w:t>
             </w:r>
           </w:p>
         </w:tc>
         <w:tc>
           <w:tcPr>
             <w:tcW w:type="dxa" w:w="283"/>
-            <w:shd w:fill="FFFFFF"/>
-          </w:tcPr>
-          <w:p>
-            <w:pPr>
-              <w:spacing w:before="20" w:after="20"/>
-              <w:jc w:val="center"/>
-            </w:pPr>
-            <w:r/>
-            <w:r>
-              <w:rPr>
-                <w:rFonts w:ascii="Calibri" w:hAnsi="Calibri"/>
-                <w:sz w:val="16"/>
-              </w:rPr>
-              <w:t>L</w:t>
+            <w:shd w:fill="D4EDDA"/>
+          </w:tcPr>
+          <w:p>
+            <w:pPr>
+              <w:spacing w:before="20" w:after="20"/>
+              <w:jc w:val="center"/>
+            </w:pPr>
+            <w:r/>
+            <w:r>
+              <w:rPr>
+                <w:rFonts w:ascii="Calibri" w:hAnsi="Calibri"/>
+                <w:sz w:val="16"/>
+              </w:rPr>
+              <w:t>P</w:t>
             </w:r>
           </w:p>
         </w:tc>
         <w:tc>
           <w:tcPr>
             <w:tcW w:type="dxa" w:w="1020"/>
-            <w:shd w:fill="FFFFFF"/>
-          </w:tcPr>
-          <w:p>
-            <w:pPr>
-              <w:spacing w:before="20" w:after="20"/>
-              <w:jc w:val="center"/>
-            </w:pPr>
-            <w:r/>
-            <w:r>
-              <w:rPr>
-                <w:rFonts w:ascii="Calibri" w:hAnsi="Calibri"/>
-                <w:sz w:val="16"/>
-              </w:rPr>
-              <w:t>3204351808630003</w:t>
+            <w:shd w:fill="D4EDDA"/>
+          </w:tcPr>
+          <w:p>
+            <w:pPr>
+              <w:spacing w:before="20" w:after="20"/>
+              <w:jc w:val="center"/>
+            </w:pPr>
+            <w:r/>
+            <w:r>
+              <w:rPr>
+                <w:rFonts w:ascii="Calibri" w:hAnsi="Calibri"/>
+                <w:sz w:val="16"/>
+              </w:rPr>
+              <w:t>3204356010480002</w:t>
             </w:r>
           </w:p>
         </w:tc>
         <w:tc>
           <w:tcPr>
             <w:tcW w:type="dxa" w:w="1020"/>
-            <w:shd w:fill="FFFFFF"/>
-          </w:tcPr>
-          <w:p>
-            <w:pPr>
-              <w:spacing w:before="20" w:after="20"/>
-              <w:jc w:val="center"/>
-            </w:pPr>
-            <w:r/>
-            <w:r>
-              <w:rPr>
-                <w:rFonts w:ascii="Calibri" w:hAnsi="Calibri"/>
-                <w:sz w:val="16"/>
-              </w:rPr>
-              <w:t>3204352405110065</w:t>
+            <w:shd w:fill="D4EDDA"/>
+          </w:tcPr>
+          <w:p>
+            <w:pPr>
+              <w:spacing w:before="20" w:after="20"/>
+              <w:jc w:val="center"/>
+            </w:pPr>
+            <w:r/>
+            <w:r>
+              <w:rPr>
+                <w:rFonts w:ascii="Calibri" w:hAnsi="Calibri"/>
+                <w:sz w:val="16"/>
+              </w:rPr>
+              <w:t>3204352312050057</w:t>
             </w:r>
           </w:p>
         </w:tc>
         <w:tc>
           <w:tcPr>
             <w:tcW w:type="dxa" w:w="1587"/>
-            <w:shd w:fill="FFFFFF"/>
+            <w:shd w:fill="D4EDDA"/>
           </w:tcPr>
           <w:p>
             <w:pPr>
@@ -7890,14 +8982,14 @@
                 <w:rFonts w:ascii="Calibri" w:hAnsi="Calibri"/>
                 <w:sz w:val="16"/>
               </w:rPr>
-              <w:t>KP CILOPANG RT 04/07</w:t>
+              <w:t>KP BARUNAI RT 00/04</w:t>
             </w:r>
           </w:p>
         </w:tc>
         <w:tc>
           <w:tcPr>
             <w:tcW w:type="dxa" w:w="567"/>
-            <w:shd w:fill="FFFFFF"/>
+            <w:shd w:fill="D4EDDA"/>
           </w:tcPr>
           <w:p>
             <w:pPr>
@@ -7917,7 +9009,7 @@
         <w:tc>
           <w:tcPr>
             <w:tcW w:type="dxa" w:w="567"/>
-            <w:shd w:fill="FFFFFF"/>
+            <w:shd w:fill="D4EDDA"/>
           </w:tcPr>
           <w:p>
             <w:pPr>
@@ -7937,7 +9029,7 @@
         <w:tc>
           <w:tcPr>
             <w:tcW w:type="dxa" w:w="1020"/>
-            <w:shd w:fill="FFFFFF"/>
+            <w:shd w:fill="D4EDDA"/>
           </w:tcPr>
           <w:p>
             <w:pPr>
@@ -7950,7 +9042,7 @@
                 <w:rFonts w:ascii="Calibri" w:hAnsi="Calibri"/>
                 <w:sz w:val="16"/>
               </w:rPr>
-              <w:t>ACC</w:t>
+              <w:t>★ Data Pengganti</w:t>
             </w:r>
           </w:p>
         </w:tc>
@@ -7959,27 +9051,27 @@
         <w:tc>
           <w:tcPr>
             <w:tcW w:type="dxa" w:w="340"/>
-            <w:shd w:fill="E7E4DF"/>
-          </w:tcPr>
-          <w:p>
-            <w:pPr>
-              <w:spacing w:before="20" w:after="20"/>
-              <w:jc w:val="center"/>
-            </w:pPr>
-            <w:r/>
-            <w:r>
-              <w:rPr>
-                <w:rFonts w:ascii="Calibri" w:hAnsi="Calibri"/>
-                <w:sz w:val="16"/>
-              </w:rPr>
-              <w:t>40</w:t>
+            <w:shd w:fill="D4EDDA"/>
+          </w:tcPr>
+          <w:p>
+            <w:pPr>
+              <w:spacing w:before="20" w:after="20"/>
+              <w:jc w:val="center"/>
+            </w:pPr>
+            <w:r/>
+            <w:r>
+              <w:rPr>
+                <w:rFonts w:ascii="Calibri" w:hAnsi="Calibri"/>
+                <w:sz w:val="16"/>
+              </w:rPr>
+              <w:t>46</w:t>
             </w:r>
           </w:p>
         </w:tc>
         <w:tc>
           <w:tcPr>
             <w:tcW w:type="dxa" w:w="1247"/>
-            <w:shd w:fill="E7E4DF"/>
+            <w:shd w:fill="D4EDDA"/>
           </w:tcPr>
           <w:p>
             <w:pPr>
@@ -7992,74 +9084,74 @@
                 <w:rFonts w:ascii="Calibri" w:hAnsi="Calibri"/>
                 <w:sz w:val="16"/>
               </w:rPr>
-              <w:t>ICAH</w:t>
+              <w:t>EKUR</w:t>
             </w:r>
           </w:p>
         </w:tc>
         <w:tc>
           <w:tcPr>
             <w:tcW w:type="dxa" w:w="283"/>
-            <w:shd w:fill="E7E4DF"/>
-          </w:tcPr>
-          <w:p>
-            <w:pPr>
-              <w:spacing w:before="20" w:after="20"/>
-              <w:jc w:val="center"/>
-            </w:pPr>
-            <w:r/>
-            <w:r>
-              <w:rPr>
-                <w:rFonts w:ascii="Calibri" w:hAnsi="Calibri"/>
-                <w:sz w:val="16"/>
-              </w:rPr>
-              <w:t>P</w:t>
+            <w:shd w:fill="D4EDDA"/>
+          </w:tcPr>
+          <w:p>
+            <w:pPr>
+              <w:spacing w:before="20" w:after="20"/>
+              <w:jc w:val="center"/>
+            </w:pPr>
+            <w:r/>
+            <w:r>
+              <w:rPr>
+                <w:rFonts w:ascii="Calibri" w:hAnsi="Calibri"/>
+                <w:sz w:val="16"/>
+              </w:rPr>
+              <w:t>L</w:t>
             </w:r>
           </w:p>
         </w:tc>
         <w:tc>
           <w:tcPr>
             <w:tcW w:type="dxa" w:w="1020"/>
-            <w:shd w:fill="E7E4DF"/>
-          </w:tcPr>
-          <w:p>
-            <w:pPr>
-              <w:spacing w:before="20" w:after="20"/>
-              <w:jc w:val="center"/>
-            </w:pPr>
-            <w:r/>
-            <w:r>
-              <w:rPr>
-                <w:rFonts w:ascii="Calibri" w:hAnsi="Calibri"/>
-                <w:sz w:val="16"/>
-              </w:rPr>
-              <w:t>-</w:t>
+            <w:shd w:fill="D4EDDA"/>
+          </w:tcPr>
+          <w:p>
+            <w:pPr>
+              <w:spacing w:before="20" w:after="20"/>
+              <w:jc w:val="center"/>
+            </w:pPr>
+            <w:r/>
+            <w:r>
+              <w:rPr>
+                <w:rFonts w:ascii="Calibri" w:hAnsi="Calibri"/>
+                <w:sz w:val="16"/>
+              </w:rPr>
+              <w:t>3204354903820003</w:t>
             </w:r>
           </w:p>
         </w:tc>
         <w:tc>
           <w:tcPr>
             <w:tcW w:type="dxa" w:w="1020"/>
-            <w:shd w:fill="E7E4DF"/>
-          </w:tcPr>
-          <w:p>
-            <w:pPr>
-              <w:spacing w:before="20" w:after="20"/>
-              <w:jc w:val="center"/>
-            </w:pPr>
-            <w:r/>
-            <w:r>
-              <w:rPr>
-                <w:rFonts w:ascii="Calibri" w:hAnsi="Calibri"/>
-                <w:sz w:val="16"/>
-              </w:rPr>
-              <w:t>-</w:t>
+            <w:shd w:fill="D4EDDA"/>
+          </w:tcPr>
+          <w:p>
+            <w:pPr>
+              <w:spacing w:before="20" w:after="20"/>
+              <w:jc w:val="center"/>
+            </w:pPr>
+            <w:r/>
+            <w:r>
+              <w:rPr>
+                <w:rFonts w:ascii="Calibri" w:hAnsi="Calibri"/>
+                <w:sz w:val="16"/>
+              </w:rPr>
+              <w:t>3204351210230005</w:t>
             </w:r>
           </w:p>
         </w:tc>
         <w:tc>
           <w:tcPr>
             <w:tcW w:type="dxa" w:w="1587"/>
-            <w:shd w:fill="E7E4DF"/>
+            <w:shd w:fill="D4EDDA"/>
           </w:tcPr>
           <w:p>
             <w:pPr>
@@ -8072,14 +9164,14 @@
                 <w:rFonts w:ascii="Calibri" w:hAnsi="Calibri"/>
                 <w:sz w:val="16"/>
               </w:rPr>
-              <w:t>-</w:t>
+              <w:t>KP LOA RT 003 RW 010</w:t>
             </w:r>
           </w:p>
         </w:tc>
         <w:tc>
           <w:tcPr>
             <w:tcW w:type="dxa" w:w="567"/>
-            <w:shd w:fill="E7E4DF"/>
+            <w:shd w:fill="D4EDDA"/>
           </w:tcPr>
           <w:p>
             <w:pPr>
@@ -8099,7 +9191,7 @@
         <w:tc>
           <w:tcPr>
             <w:tcW w:type="dxa" w:w="567"/>
-            <w:shd w:fill="E7E4DF"/>
+            <w:shd w:fill="D4EDDA"/>
           </w:tcPr>
           <w:p>
             <w:pPr>
@@ -8119,7 +9211,7 @@
         <w:tc>
           <w:tcPr>
             <w:tcW w:type="dxa" w:w="1020"/>
-            <w:shd w:fill="E7E4DF"/>
+            <w:shd w:fill="D4EDDA"/>
           </w:tcPr>
           <w:p>
             <w:pPr>
@@ -8132,7 +9224,7 @@
                 <w:rFonts w:ascii="Calibri" w:hAnsi="Calibri"/>
                 <w:sz w:val="16"/>
               </w:rPr>
-              <w:t>ACC</w:t>
+              <w:t>★ Data Pengganti</w:t>
             </w:r>
           </w:p>
         </w:tc>
@@ -8141,27 +9233,27 @@
         <w:tc>
           <w:tcPr>
             <w:tcW w:type="dxa" w:w="340"/>
-            <w:shd w:fill="FFFFFF"/>
-          </w:tcPr>
-          <w:p>
-            <w:pPr>
-              <w:spacing w:before="20" w:after="20"/>
-              <w:jc w:val="center"/>
-            </w:pPr>
-            <w:r/>
-            <w:r>
-              <w:rPr>
-                <w:rFonts w:ascii="Calibri" w:hAnsi="Calibri"/>
-                <w:sz w:val="16"/>
-              </w:rPr>
-              <w:t>41</w:t>
+            <w:shd w:fill="D4EDDA"/>
+          </w:tcPr>
+          <w:p>
+            <w:pPr>
+              <w:spacing w:before="20" w:after="20"/>
+              <w:jc w:val="center"/>
+            </w:pPr>
+            <w:r/>
+            <w:r>
+              <w:rPr>
+                <w:rFonts w:ascii="Calibri" w:hAnsi="Calibri"/>
+                <w:sz w:val="16"/>
+              </w:rPr>
+              <w:t>47</w:t>
             </w:r>
           </w:p>
         </w:tc>
         <w:tc>
           <w:tcPr>
             <w:tcW w:type="dxa" w:w="1247"/>
-            <w:shd w:fill="FFFFFF"/>
+            <w:shd w:fill="D4EDDA"/>
           </w:tcPr>
           <w:p>
             <w:pPr>
@@ -8174,74 +9266,74 @@
                 <w:rFonts w:ascii="Calibri" w:hAnsi="Calibri"/>
                 <w:sz w:val="16"/>
               </w:rPr>
-              <w:t>ADANG</w:t>
+              <w:t>CARMA DEDI</w:t>
             </w:r>
           </w:p>
         </w:tc>
         <w:tc>
           <w:tcPr>
             <w:tcW w:type="dxa" w:w="283"/>
-            <w:shd w:fill="FFFFFF"/>
-          </w:tcPr>
-          <w:p>
-            <w:pPr>
-              <w:spacing w:before="20" w:after="20"/>
-              <w:jc w:val="center"/>
-            </w:pPr>
-            <w:r/>
-            <w:r>
-              <w:rPr>
-                <w:rFonts w:ascii="Calibri" w:hAnsi="Calibri"/>
-                <w:sz w:val="16"/>
-              </w:rPr>
-              <w:t>P</w:t>
+            <w:shd w:fill="D4EDDA"/>
+          </w:tcPr>
+          <w:p>
+            <w:pPr>
+              <w:spacing w:before="20" w:after="20"/>
+              <w:jc w:val="center"/>
+            </w:pPr>
+            <w:r/>
+            <w:r>
+              <w:rPr>
+                <w:rFonts w:ascii="Calibri" w:hAnsi="Calibri"/>
+                <w:sz w:val="16"/>
+              </w:rPr>
+              <w:t>L</w:t>
             </w:r>
           </w:p>
         </w:tc>
         <w:tc>
           <w:tcPr>
             <w:tcW w:type="dxa" w:w="1020"/>
-            <w:shd w:fill="FFFFFF"/>
-          </w:tcPr>
-          <w:p>
-            <w:pPr>
-              <w:spacing w:before="20" w:after="20"/>
-              <w:jc w:val="center"/>
-            </w:pPr>
-            <w:r/>
-            <w:r>
-              <w:rPr>
-                <w:rFonts w:ascii="Calibri" w:hAnsi="Calibri"/>
-                <w:sz w:val="16"/>
-              </w:rPr>
-              <w:t>3204364406880002</w:t>
+            <w:shd w:fill="D4EDDA"/>
+          </w:tcPr>
+          <w:p>
+            <w:pPr>
+              <w:spacing w:before="20" w:after="20"/>
+              <w:jc w:val="center"/>
+            </w:pPr>
+            <w:r/>
+            <w:r>
+              <w:rPr>
+                <w:rFonts w:ascii="Calibri" w:hAnsi="Calibri"/>
+                <w:sz w:val="16"/>
+              </w:rPr>
+              <w:t>3204351207600004</w:t>
             </w:r>
           </w:p>
         </w:tc>
         <w:tc>
           <w:tcPr>
             <w:tcW w:type="dxa" w:w="1020"/>
-            <w:shd w:fill="FFFFFF"/>
-          </w:tcPr>
-          <w:p>
-            <w:pPr>
-              <w:spacing w:before="20" w:after="20"/>
-              <w:jc w:val="center"/>
-            </w:pPr>
-            <w:r/>
-            <w:r>
-              <w:rPr>
-                <w:rFonts w:ascii="Calibri" w:hAnsi="Calibri"/>
-                <w:sz w:val="16"/>
-              </w:rPr>
-              <w:t>3204361108120039</w:t>
+            <w:shd w:fill="D4EDDA"/>
+          </w:tcPr>
+          <w:p>
+            <w:pPr>
+              <w:spacing w:before="20" w:after="20"/>
+              <w:jc w:val="center"/>
+            </w:pPr>
+            <w:r/>
+            <w:r>
+              <w:rPr>
+                <w:rFonts w:ascii="Calibri" w:hAnsi="Calibri"/>
+                <w:sz w:val="16"/>
+              </w:rPr>
+              <w:t>3204350101060016</w:t>
             </w:r>
           </w:p>
         </w:tc>
         <w:tc>
           <w:tcPr>
             <w:tcW w:type="dxa" w:w="1587"/>
-            <w:shd w:fill="FFFFFF"/>
+            <w:shd w:fill="D4EDDA"/>
           </w:tcPr>
           <w:p>
             <w:pPr>
@@ -8254,14 +9346,14 @@
                 <w:rFonts w:ascii="Calibri" w:hAnsi="Calibri"/>
                 <w:sz w:val="16"/>
               </w:rPr>
-              <w:t>KP CICANAR RT 1 RW 12</w:t>
+              <w:t>KP CIDADAP RT 004 RW 005</w:t>
             </w:r>
           </w:p>
         </w:tc>
         <w:tc>
           <w:tcPr>
             <w:tcW w:type="dxa" w:w="567"/>
-            <w:shd w:fill="FFFFFF"/>
+            <w:shd w:fill="D4EDDA"/>
           </w:tcPr>
           <w:p>
             <w:pPr>
@@ -8281,7 +9373,7 @@
         <w:tc>
           <w:tcPr>
             <w:tcW w:type="dxa" w:w="567"/>
-            <w:shd w:fill="FFFFFF"/>
+            <w:shd w:fill="D4EDDA"/>
           </w:tcPr>
           <w:p>
             <w:pPr>
@@ -8301,7 +9393,7 @@
         <w:tc>
           <w:tcPr>
             <w:tcW w:type="dxa" w:w="1020"/>
-            <w:shd w:fill="FFFFFF"/>
+            <w:shd w:fill="D4EDDA"/>
           </w:tcPr>
           <w:p>
             <w:pPr>
@@ -8314,7 +9406,7 @@
                 <w:rFonts w:ascii="Calibri" w:hAnsi="Calibri"/>
                 <w:sz w:val="16"/>
               </w:rPr>
-              <w:t>ACC</w:t>
+              <w:t>★ Data Pengganti</w:t>
             </w:r>
           </w:p>
         </w:tc>
@@ -8323,27 +9415,27 @@
         <w:tc>
           <w:tcPr>
             <w:tcW w:type="dxa" w:w="340"/>
-            <w:shd w:fill="E7E4DF"/>
-          </w:tcPr>
-          <w:p>
-            <w:pPr>
-              <w:spacing w:before="20" w:after="20"/>
-              <w:jc w:val="center"/>
-            </w:pPr>
-            <w:r/>
-            <w:r>
-              <w:rPr>
-                <w:rFonts w:ascii="Calibri" w:hAnsi="Calibri"/>
-                <w:sz w:val="16"/>
-              </w:rPr>
-              <w:t>42</w:t>
+            <w:shd w:fill="D4EDDA"/>
+          </w:tcPr>
+          <w:p>
+            <w:pPr>
+              <w:spacing w:before="20" w:after="20"/>
+              <w:jc w:val="center"/>
+            </w:pPr>
+            <w:r/>
+            <w:r>
+              <w:rPr>
+                <w:rFonts w:ascii="Calibri" w:hAnsi="Calibri"/>
+                <w:sz w:val="16"/>
+              </w:rPr>
+              <w:t>48</w:t>
             </w:r>
           </w:p>
         </w:tc>
         <w:tc>
           <w:tcPr>
             <w:tcW w:type="dxa" w:w="1247"/>
-            <w:shd w:fill="E7E4DF"/>
+            <w:shd w:fill="D4EDDA"/>
           </w:tcPr>
           <w:p>
             <w:pPr>
@@ -8356,14 +9448,14 @@
                 <w:rFonts w:ascii="Calibri" w:hAnsi="Calibri"/>
                 <w:sz w:val="16"/>
               </w:rPr>
-              <w:t>ADE</w:t>
+              <w:t>UJANG JUJUN</w:t>
             </w:r>
           </w:p>
         </w:tc>
         <w:tc>
           <w:tcPr>
             <w:tcW w:type="dxa" w:w="283"/>
-            <w:shd w:fill="E7E4DF"/>
+            <w:shd w:fill="D4EDDA"/>
           </w:tcPr>
           <w:p>
             <w:pPr>
@@ -8383,47 +9475,47 @@
         <w:tc>
           <w:tcPr>
             <w:tcW w:type="dxa" w:w="1020"/>
-            <w:shd w:fill="E7E4DF"/>
-          </w:tcPr>
-          <w:p>
-            <w:pPr>
-              <w:spacing w:before="20" w:after="20"/>
-              <w:jc w:val="center"/>
-            </w:pPr>
-            <w:r/>
-            <w:r>
-              <w:rPr>
-                <w:rFonts w:ascii="Calibri" w:hAnsi="Calibri"/>
-                <w:sz w:val="16"/>
-              </w:rPr>
-              <w:t>3204351205630001</w:t>
+            <w:shd w:fill="D4EDDA"/>
+          </w:tcPr>
+          <w:p>
+            <w:pPr>
+              <w:spacing w:before="20" w:after="20"/>
+              <w:jc w:val="center"/>
+            </w:pPr>
+            <w:r/>
+            <w:r>
+              <w:rPr>
+                <w:rFonts w:ascii="Calibri" w:hAnsi="Calibri"/>
+                <w:sz w:val="16"/>
+              </w:rPr>
+              <w:t>3204350204580001</w:t>
             </w:r>
           </w:p>
         </w:tc>
         <w:tc>
           <w:tcPr>
             <w:tcW w:type="dxa" w:w="1020"/>
-            <w:shd w:fill="E7E4DF"/>
-          </w:tcPr>
-          <w:p>
-            <w:pPr>
-              <w:spacing w:before="20" w:after="20"/>
-              <w:jc w:val="center"/>
-            </w:pPr>
-            <w:r/>
-            <w:r>
-              <w:rPr>
-                <w:rFonts w:ascii="Calibri" w:hAnsi="Calibri"/>
-                <w:sz w:val="16"/>
-              </w:rPr>
-              <w:t>3204351903050814</w:t>
+            <w:shd w:fill="D4EDDA"/>
+          </w:tcPr>
+          <w:p>
+            <w:pPr>
+              <w:spacing w:before="20" w:after="20"/>
+              <w:jc w:val="center"/>
+            </w:pPr>
+            <w:r/>
+            <w:r>
+              <w:rPr>
+                <w:rFonts w:ascii="Calibri" w:hAnsi="Calibri"/>
+                <w:sz w:val="16"/>
+              </w:rPr>
+              <w:t>3204351803050591</w:t>
             </w:r>
           </w:p>
         </w:tc>
         <w:tc>
           <w:tcPr>
             <w:tcW w:type="dxa" w:w="1587"/>
-            <w:shd w:fill="E7E4DF"/>
+            <w:shd w:fill="D4EDDA"/>
           </w:tcPr>
           <w:p>
             <w:pPr>
@@ -8436,14 +9528,14 @@
                 <w:rFonts w:ascii="Calibri" w:hAnsi="Calibri"/>
                 <w:sz w:val="16"/>
               </w:rPr>
-              <w:t>KP MALANG RT 5 RW 6</w:t>
+              <w:t>KP LOA RT 003 RW 002</w:t>
             </w:r>
           </w:p>
         </w:tc>
         <w:tc>
           <w:tcPr>
             <w:tcW w:type="dxa" w:w="567"/>
-            <w:shd w:fill="E7E4DF"/>
+            <w:shd w:fill="D4EDDA"/>
           </w:tcPr>
           <w:p>
             <w:pPr>
@@ -8463,7 +9555,7 @@
         <w:tc>
           <w:tcPr>
             <w:tcW w:type="dxa" w:w="567"/>
-            <w:shd w:fill="E7E4DF"/>
+            <w:shd w:fill="D4EDDA"/>
           </w:tcPr>
           <w:p>
             <w:pPr>
@@ -8483,7 +9575,7 @@
         <w:tc>
           <w:tcPr>
             <w:tcW w:type="dxa" w:w="1020"/>
-            <w:shd w:fill="E7E4DF"/>
+            <w:shd w:fill="D4EDDA"/>
           </w:tcPr>
           <w:p>
             <w:pPr>
@@ -8496,7 +9588,7 @@
                 <w:rFonts w:ascii="Calibri" w:hAnsi="Calibri"/>
                 <w:sz w:val="16"/>
               </w:rPr>
-              <w:t>ACC</w:t>
+              <w:t>★ Data Pengganti</w:t>
             </w:r>
           </w:p>
         </w:tc>
@@ -8505,1098 +9597,6 @@
         <w:tc>
           <w:tcPr>
             <w:tcW w:type="dxa" w:w="340"/>
-            <w:shd w:fill="FFFFFF"/>
-          </w:tcPr>
-          <w:p>
-            <w:pPr>
-              <w:spacing w:before="20" w:after="20"/>
-              <w:jc w:val="center"/>
-            </w:pPr>
-            <w:r/>
-            <w:r>
-              <w:rPr>
-                <w:rFonts w:ascii="Calibri" w:hAnsi="Calibri"/>
-                <w:sz w:val="16"/>
-              </w:rPr>
-              <w:t>43</w:t>
-            </w:r>
-          </w:p>
-        </w:tc>
-        <w:tc>
-          <w:tcPr>
-            <w:tcW w:type="dxa" w:w="1247"/>
-            <w:shd w:fill="FFFFFF"/>
-          </w:tcPr>
-          <w:p>
-            <w:pPr>
-              <w:spacing w:before="20" w:after="20"/>
-              <w:jc w:val="left"/>
-            </w:pPr>
-            <w:r/>
-            <w:r>
-              <w:rPr>
-                <w:rFonts w:ascii="Calibri" w:hAnsi="Calibri"/>
-                <w:sz w:val="16"/>
-              </w:rPr>
-              <w:t>ANAH</w:t>
-            </w:r>
-          </w:p>
-        </w:tc>
-        <w:tc>
-          <w:tcPr>
-            <w:tcW w:type="dxa" w:w="283"/>
-            <w:shd w:fill="FFFFFF"/>
-          </w:tcPr>
-          <w:p>
-            <w:pPr>
-              <w:spacing w:before="20" w:after="20"/>
-              <w:jc w:val="center"/>
-            </w:pPr>
-            <w:r/>
-            <w:r>
-              <w:rPr>
-                <w:rFonts w:ascii="Calibri" w:hAnsi="Calibri"/>
-                <w:sz w:val="16"/>
-              </w:rPr>
-              <w:t>P</w:t>
-            </w:r>
-          </w:p>
-        </w:tc>
-        <w:tc>
-          <w:tcPr>
-            <w:tcW w:type="dxa" w:w="1020"/>
-            <w:shd w:fill="FFFFFF"/>
-          </w:tcPr>
-          <w:p>
-            <w:pPr>
-              <w:spacing w:before="20" w:after="20"/>
-              <w:jc w:val="center"/>
-            </w:pPr>
-            <w:r/>
-            <w:r>
-              <w:rPr>
-                <w:rFonts w:ascii="Calibri" w:hAnsi="Calibri"/>
-                <w:sz w:val="16"/>
-              </w:rPr>
-              <w:t>3204354304480004</w:t>
-            </w:r>
-          </w:p>
-        </w:tc>
-        <w:tc>
-          <w:tcPr>
-            <w:tcW w:type="dxa" w:w="1020"/>
-            <w:shd w:fill="FFFFFF"/>
-          </w:tcPr>
-          <w:p>
-            <w:pPr>
-              <w:spacing w:before="20" w:after="20"/>
-              <w:jc w:val="center"/>
-            </w:pPr>
-            <w:r/>
-            <w:r>
-              <w:rPr>
-                <w:rFonts w:ascii="Calibri" w:hAnsi="Calibri"/>
-                <w:sz w:val="16"/>
-              </w:rPr>
-              <w:t>3204352201200003</w:t>
-            </w:r>
-          </w:p>
-        </w:tc>
-        <w:tc>
-          <w:tcPr>
-            <w:tcW w:type="dxa" w:w="1587"/>
-            <w:shd w:fill="FFFFFF"/>
-          </w:tcPr>
-          <w:p>
-            <w:pPr>
-              <w:spacing w:before="20" w:after="20"/>
-              <w:jc w:val="left"/>
-            </w:pPr>
-            <w:r/>
-            <w:r>
-              <w:rPr>
-                <w:rFonts w:ascii="Calibri" w:hAnsi="Calibri"/>
-                <w:sz w:val="16"/>
-              </w:rPr>
-              <w:t>KP NENGENG RT 2 RW 4</w:t>
-            </w:r>
-          </w:p>
-        </w:tc>
-        <w:tc>
-          <w:tcPr>
-            <w:tcW w:type="dxa" w:w="567"/>
-            <w:shd w:fill="FFFFFF"/>
-          </w:tcPr>
-          <w:p>
-            <w:pPr>
-              <w:spacing w:before="20" w:after="20"/>
-              <w:jc w:val="center"/>
-            </w:pPr>
-            <w:r/>
-            <w:r>
-              <w:rPr>
-                <w:rFonts w:ascii="Calibri" w:hAnsi="Calibri"/>
-                <w:sz w:val="16"/>
-              </w:rPr>
-              <w:t>LOA</w:t>
-            </w:r>
-          </w:p>
-        </w:tc>
-        <w:tc>
-          <w:tcPr>
-            <w:tcW w:type="dxa" w:w="567"/>
-            <w:shd w:fill="FFFFFF"/>
-          </w:tcPr>
-          <w:p>
-            <w:pPr>
-              <w:spacing w:before="20" w:after="20"/>
-              <w:jc w:val="center"/>
-            </w:pPr>
-            <w:r/>
-            <w:r>
-              <w:rPr>
-                <w:rFonts w:ascii="Calibri" w:hAnsi="Calibri"/>
-                <w:sz w:val="16"/>
-              </w:rPr>
-              <w:t>PASEH</w:t>
-            </w:r>
-          </w:p>
-        </w:tc>
-        <w:tc>
-          <w:tcPr>
-            <w:tcW w:type="dxa" w:w="1020"/>
-            <w:shd w:fill="FFFFFF"/>
-          </w:tcPr>
-          <w:p>
-            <w:pPr>
-              <w:spacing w:before="20" w:after="20"/>
-              <w:jc w:val="left"/>
-            </w:pPr>
-            <w:r/>
-            <w:r>
-              <w:rPr>
-                <w:rFonts w:ascii="Calibri" w:hAnsi="Calibri"/>
-                <w:sz w:val="16"/>
-              </w:rPr>
-              <w:t>ACC</w:t>
-            </w:r>
-          </w:p>
-        </w:tc>
-      </w:tr>
-      <w:tr>
-        <w:tc>
-          <w:tcPr>
-            <w:tcW w:type="dxa" w:w="340"/>
-            <w:shd w:fill="E7E4DF"/>
-          </w:tcPr>
-          <w:p>
-            <w:pPr>
-              <w:spacing w:before="20" w:after="20"/>
-              <w:jc w:val="center"/>
-            </w:pPr>
-            <w:r/>
-            <w:r>
-              <w:rPr>
-                <w:rFonts w:ascii="Calibri" w:hAnsi="Calibri"/>
-                <w:sz w:val="16"/>
-              </w:rPr>
-              <w:t>44</w:t>
-            </w:r>
-          </w:p>
-        </w:tc>
-        <w:tc>
-          <w:tcPr>
-            <w:tcW w:type="dxa" w:w="1247"/>
-            <w:shd w:fill="E7E4DF"/>
-          </w:tcPr>
-          <w:p>
-            <w:pPr>
-              <w:spacing w:before="20" w:after="20"/>
-              <w:jc w:val="left"/>
-            </w:pPr>
-            <w:r/>
-            <w:r>
-              <w:rPr>
-                <w:rFonts w:ascii="Calibri" w:hAnsi="Calibri"/>
-                <w:sz w:val="16"/>
-              </w:rPr>
-              <w:t>WAHYU WIBISANA</w:t>
-            </w:r>
-          </w:p>
-        </w:tc>
-        <w:tc>
-          <w:tcPr>
-            <w:tcW w:type="dxa" w:w="283"/>
-            <w:shd w:fill="E7E4DF"/>
-          </w:tcPr>
-          <w:p>
-            <w:pPr>
-              <w:spacing w:before="20" w:after="20"/>
-              <w:jc w:val="center"/>
-            </w:pPr>
-            <w:r/>
-            <w:r>
-              <w:rPr>
-                <w:rFonts w:ascii="Calibri" w:hAnsi="Calibri"/>
-                <w:sz w:val="16"/>
-              </w:rPr>
-              <w:t>L</w:t>
-            </w:r>
-          </w:p>
-        </w:tc>
-        <w:tc>
-          <w:tcPr>
-            <w:tcW w:type="dxa" w:w="1020"/>
-            <w:shd w:fill="E7E4DF"/>
-          </w:tcPr>
-          <w:p>
-            <w:pPr>
-              <w:spacing w:before="20" w:after="20"/>
-              <w:jc w:val="center"/>
-            </w:pPr>
-            <w:r/>
-            <w:r>
-              <w:rPr>
-                <w:rFonts w:ascii="Calibri" w:hAnsi="Calibri"/>
-                <w:sz w:val="16"/>
-              </w:rPr>
-              <w:t>3204353112600001</w:t>
-            </w:r>
-          </w:p>
-        </w:tc>
-        <w:tc>
-          <w:tcPr>
-            <w:tcW w:type="dxa" w:w="1020"/>
-            <w:shd w:fill="E7E4DF"/>
-          </w:tcPr>
-          <w:p>
-            <w:pPr>
-              <w:spacing w:before="20" w:after="20"/>
-              <w:jc w:val="center"/>
-            </w:pPr>
-            <w:r/>
-            <w:r>
-              <w:rPr>
-                <w:rFonts w:ascii="Calibri" w:hAnsi="Calibri"/>
-                <w:sz w:val="16"/>
-              </w:rPr>
-              <w:t>3204350701060146</w:t>
-            </w:r>
-          </w:p>
-        </w:tc>
-        <w:tc>
-          <w:tcPr>
-            <w:tcW w:type="dxa" w:w="1587"/>
-            <w:shd w:fill="E7E4DF"/>
-          </w:tcPr>
-          <w:p>
-            <w:pPr>
-              <w:spacing w:before="20" w:after="20"/>
-              <w:jc w:val="left"/>
-            </w:pPr>
-            <w:r/>
-            <w:r>
-              <w:rPr>
-                <w:rFonts w:ascii="Calibri" w:hAnsi="Calibri"/>
-                <w:sz w:val="16"/>
-              </w:rPr>
-              <w:t>LIMUS MANGGUNG RT 3 RW 8</w:t>
-            </w:r>
-          </w:p>
-        </w:tc>
-        <w:tc>
-          <w:tcPr>
-            <w:tcW w:type="dxa" w:w="567"/>
-            <w:shd w:fill="E7E4DF"/>
-          </w:tcPr>
-          <w:p>
-            <w:pPr>
-              <w:spacing w:before="20" w:after="20"/>
-              <w:jc w:val="center"/>
-            </w:pPr>
-            <w:r/>
-            <w:r>
-              <w:rPr>
-                <w:rFonts w:ascii="Calibri" w:hAnsi="Calibri"/>
-                <w:sz w:val="16"/>
-              </w:rPr>
-              <w:t>LOA</w:t>
-            </w:r>
-          </w:p>
-        </w:tc>
-        <w:tc>
-          <w:tcPr>
-            <w:tcW w:type="dxa" w:w="567"/>
-            <w:shd w:fill="E7E4DF"/>
-          </w:tcPr>
-          <w:p>
-            <w:pPr>
-              <w:spacing w:before="20" w:after="20"/>
-              <w:jc w:val="center"/>
-            </w:pPr>
-            <w:r/>
-            <w:r>
-              <w:rPr>
-                <w:rFonts w:ascii="Calibri" w:hAnsi="Calibri"/>
-                <w:sz w:val="16"/>
-              </w:rPr>
-              <w:t>PASEH</w:t>
-            </w:r>
-          </w:p>
-        </w:tc>
-        <w:tc>
-          <w:tcPr>
-            <w:tcW w:type="dxa" w:w="1020"/>
-            <w:shd w:fill="E7E4DF"/>
-          </w:tcPr>
-          <w:p>
-            <w:pPr>
-              <w:spacing w:before="20" w:after="20"/>
-              <w:jc w:val="left"/>
-            </w:pPr>
-            <w:r/>
-            <w:r>
-              <w:rPr>
-                <w:rFonts w:ascii="Calibri" w:hAnsi="Calibri"/>
-                <w:sz w:val="16"/>
-              </w:rPr>
-              <w:t>ACC</w:t>
-            </w:r>
-          </w:p>
-        </w:tc>
-      </w:tr>
-      <w:tr>
-        <w:tc>
-          <w:tcPr>
-            <w:tcW w:type="dxa" w:w="340"/>
-            <w:shd w:fill="FFFFFF"/>
-          </w:tcPr>
-          <w:p>
-            <w:pPr>
-              <w:spacing w:before="20" w:after="20"/>
-              <w:jc w:val="center"/>
-            </w:pPr>
-            <w:r/>
-            <w:r>
-              <w:rPr>
-                <w:rFonts w:ascii="Calibri" w:hAnsi="Calibri"/>
-                <w:sz w:val="16"/>
-              </w:rPr>
-              <w:t>45</w:t>
-            </w:r>
-          </w:p>
-        </w:tc>
-        <w:tc>
-          <w:tcPr>
-            <w:tcW w:type="dxa" w:w="1247"/>
-            <w:shd w:fill="FFFFFF"/>
-          </w:tcPr>
-          <w:p>
-            <w:pPr>
-              <w:spacing w:before="20" w:after="20"/>
-              <w:jc w:val="left"/>
-            </w:pPr>
-            <w:r/>
-            <w:r>
-              <w:rPr>
-                <w:rFonts w:ascii="Calibri" w:hAnsi="Calibri"/>
-                <w:sz w:val="16"/>
-              </w:rPr>
-              <w:t>ECIN</w:t>
-            </w:r>
-          </w:p>
-        </w:tc>
-        <w:tc>
-          <w:tcPr>
-            <w:tcW w:type="dxa" w:w="283"/>
-            <w:shd w:fill="FFFFFF"/>
-          </w:tcPr>
-          <w:p>
-            <w:pPr>
-              <w:spacing w:before="20" w:after="20"/>
-              <w:jc w:val="center"/>
-            </w:pPr>
-            <w:r/>
-            <w:r>
-              <w:rPr>
-                <w:rFonts w:ascii="Calibri" w:hAnsi="Calibri"/>
-                <w:sz w:val="16"/>
-              </w:rPr>
-              <w:t>P</w:t>
-            </w:r>
-          </w:p>
-        </w:tc>
-        <w:tc>
-          <w:tcPr>
-            <w:tcW w:type="dxa" w:w="1020"/>
-            <w:shd w:fill="FFFFFF"/>
-          </w:tcPr>
-          <w:p>
-            <w:pPr>
-              <w:spacing w:before="20" w:after="20"/>
-              <w:jc w:val="center"/>
-            </w:pPr>
-            <w:r/>
-            <w:r>
-              <w:rPr>
-                <w:rFonts w:ascii="Calibri" w:hAnsi="Calibri"/>
-                <w:sz w:val="16"/>
-              </w:rPr>
-              <w:t>3204356010480002</w:t>
-            </w:r>
-          </w:p>
-        </w:tc>
-        <w:tc>
-          <w:tcPr>
-            <w:tcW w:type="dxa" w:w="1020"/>
-            <w:shd w:fill="FFFFFF"/>
-          </w:tcPr>
-          <w:p>
-            <w:pPr>
-              <w:spacing w:before="20" w:after="20"/>
-              <w:jc w:val="center"/>
-            </w:pPr>
-            <w:r/>
-            <w:r>
-              <w:rPr>
-                <w:rFonts w:ascii="Calibri" w:hAnsi="Calibri"/>
-                <w:sz w:val="16"/>
-              </w:rPr>
-              <w:t>3204352312050057</w:t>
-            </w:r>
-          </w:p>
-        </w:tc>
-        <w:tc>
-          <w:tcPr>
-            <w:tcW w:type="dxa" w:w="1587"/>
-            <w:shd w:fill="FFFFFF"/>
-          </w:tcPr>
-          <w:p>
-            <w:pPr>
-              <w:spacing w:before="20" w:after="20"/>
-              <w:jc w:val="left"/>
-            </w:pPr>
-            <w:r/>
-            <w:r>
-              <w:rPr>
-                <w:rFonts w:ascii="Calibri" w:hAnsi="Calibri"/>
-                <w:sz w:val="16"/>
-              </w:rPr>
-              <w:t>KP BARUNAI RT 00/04</w:t>
-            </w:r>
-          </w:p>
-        </w:tc>
-        <w:tc>
-          <w:tcPr>
-            <w:tcW w:type="dxa" w:w="567"/>
-            <w:shd w:fill="FFFFFF"/>
-          </w:tcPr>
-          <w:p>
-            <w:pPr>
-              <w:spacing w:before="20" w:after="20"/>
-              <w:jc w:val="center"/>
-            </w:pPr>
-            <w:r/>
-            <w:r>
-              <w:rPr>
-                <w:rFonts w:ascii="Calibri" w:hAnsi="Calibri"/>
-                <w:sz w:val="16"/>
-              </w:rPr>
-              <w:t>LOA</w:t>
-            </w:r>
-          </w:p>
-        </w:tc>
-        <w:tc>
-          <w:tcPr>
-            <w:tcW w:type="dxa" w:w="567"/>
-            <w:shd w:fill="FFFFFF"/>
-          </w:tcPr>
-          <w:p>
-            <w:pPr>
-              <w:spacing w:before="20" w:after="20"/>
-              <w:jc w:val="center"/>
-            </w:pPr>
-            <w:r/>
-            <w:r>
-              <w:rPr>
-                <w:rFonts w:ascii="Calibri" w:hAnsi="Calibri"/>
-                <w:sz w:val="16"/>
-              </w:rPr>
-              <w:t>PASEH</w:t>
-            </w:r>
-          </w:p>
-        </w:tc>
-        <w:tc>
-          <w:tcPr>
-            <w:tcW w:type="dxa" w:w="1020"/>
-            <w:shd w:fill="FFFFFF"/>
-          </w:tcPr>
-          <w:p>
-            <w:pPr>
-              <w:spacing w:before="20" w:after="20"/>
-              <w:jc w:val="left"/>
-            </w:pPr>
-            <w:r/>
-            <w:r>
-              <w:rPr>
-                <w:rFonts w:ascii="Calibri" w:hAnsi="Calibri"/>
-                <w:sz w:val="16"/>
-              </w:rPr>
-              <w:t>ACC</w:t>
-            </w:r>
-          </w:p>
-        </w:tc>
-      </w:tr>
-      <w:tr>
-        <w:tc>
-          <w:tcPr>
-            <w:tcW w:type="dxa" w:w="340"/>
-            <w:shd w:fill="E7E4DF"/>
-          </w:tcPr>
-          <w:p>
-            <w:pPr>
-              <w:spacing w:before="20" w:after="20"/>
-              <w:jc w:val="center"/>
-            </w:pPr>
-            <w:r/>
-            <w:r>
-              <w:rPr>
-                <w:rFonts w:ascii="Calibri" w:hAnsi="Calibri"/>
-                <w:sz w:val="16"/>
-              </w:rPr>
-              <w:t>46</w:t>
-            </w:r>
-          </w:p>
-        </w:tc>
-        <w:tc>
-          <w:tcPr>
-            <w:tcW w:type="dxa" w:w="1247"/>
-            <w:shd w:fill="E7E4DF"/>
-          </w:tcPr>
-          <w:p>
-            <w:pPr>
-              <w:spacing w:before="20" w:after="20"/>
-              <w:jc w:val="left"/>
-            </w:pPr>
-            <w:r/>
-            <w:r>
-              <w:rPr>
-                <w:rFonts w:ascii="Calibri" w:hAnsi="Calibri"/>
-                <w:sz w:val="16"/>
-              </w:rPr>
-              <w:t>EKUR</w:t>
-            </w:r>
-          </w:p>
-        </w:tc>
-        <w:tc>
-          <w:tcPr>
-            <w:tcW w:type="dxa" w:w="283"/>
-            <w:shd w:fill="E7E4DF"/>
-          </w:tcPr>
-          <w:p>
-            <w:pPr>
-              <w:spacing w:before="20" w:after="20"/>
-              <w:jc w:val="center"/>
-            </w:pPr>
-            <w:r/>
-            <w:r>
-              <w:rPr>
-                <w:rFonts w:ascii="Calibri" w:hAnsi="Calibri"/>
-                <w:sz w:val="16"/>
-              </w:rPr>
-              <w:t>L</w:t>
-            </w:r>
-          </w:p>
-        </w:tc>
-        <w:tc>
-          <w:tcPr>
-            <w:tcW w:type="dxa" w:w="1020"/>
-            <w:shd w:fill="E7E4DF"/>
-          </w:tcPr>
-          <w:p>
-            <w:pPr>
-              <w:spacing w:before="20" w:after="20"/>
-              <w:jc w:val="center"/>
-            </w:pPr>
-            <w:r/>
-            <w:r>
-              <w:rPr>
-                <w:rFonts w:ascii="Calibri" w:hAnsi="Calibri"/>
-                <w:sz w:val="16"/>
-              </w:rPr>
-              <w:t>-</w:t>
-            </w:r>
-          </w:p>
-        </w:tc>
-        <w:tc>
-          <w:tcPr>
-            <w:tcW w:type="dxa" w:w="1020"/>
-            <w:shd w:fill="E7E4DF"/>
-          </w:tcPr>
-          <w:p>
-            <w:pPr>
-              <w:spacing w:before="20" w:after="20"/>
-              <w:jc w:val="center"/>
-            </w:pPr>
-            <w:r/>
-            <w:r>
-              <w:rPr>
-                <w:rFonts w:ascii="Calibri" w:hAnsi="Calibri"/>
-                <w:sz w:val="16"/>
-              </w:rPr>
-              <w:t>-</w:t>
-            </w:r>
-          </w:p>
-        </w:tc>
-        <w:tc>
-          <w:tcPr>
-            <w:tcW w:type="dxa" w:w="1587"/>
-            <w:shd w:fill="E7E4DF"/>
-          </w:tcPr>
-          <w:p>
-            <w:pPr>
-              <w:spacing w:before="20" w:after="20"/>
-              <w:jc w:val="left"/>
-            </w:pPr>
-            <w:r/>
-            <w:r>
-              <w:rPr>
-                <w:rFonts w:ascii="Calibri" w:hAnsi="Calibri"/>
-                <w:sz w:val="16"/>
-              </w:rPr>
-              <w:t>-</w:t>
-            </w:r>
-          </w:p>
-        </w:tc>
-        <w:tc>
-          <w:tcPr>
-            <w:tcW w:type="dxa" w:w="567"/>
-            <w:shd w:fill="E7E4DF"/>
-          </w:tcPr>
-          <w:p>
-            <w:pPr>
-              <w:spacing w:before="20" w:after="20"/>
-              <w:jc w:val="center"/>
-            </w:pPr>
-            <w:r/>
-            <w:r>
-              <w:rPr>
-                <w:rFonts w:ascii="Calibri" w:hAnsi="Calibri"/>
-                <w:sz w:val="16"/>
-              </w:rPr>
-              <w:t>LOA</w:t>
-            </w:r>
-          </w:p>
-        </w:tc>
-        <w:tc>
-          <w:tcPr>
-            <w:tcW w:type="dxa" w:w="567"/>
-            <w:shd w:fill="E7E4DF"/>
-          </w:tcPr>
-          <w:p>
-            <w:pPr>
-              <w:spacing w:before="20" w:after="20"/>
-              <w:jc w:val="center"/>
-            </w:pPr>
-            <w:r/>
-            <w:r>
-              <w:rPr>
-                <w:rFonts w:ascii="Calibri" w:hAnsi="Calibri"/>
-                <w:sz w:val="16"/>
-              </w:rPr>
-              <w:t>PASEH</w:t>
-            </w:r>
-          </w:p>
-        </w:tc>
-        <w:tc>
-          <w:tcPr>
-            <w:tcW w:type="dxa" w:w="1020"/>
-            <w:shd w:fill="E7E4DF"/>
-          </w:tcPr>
-          <w:p>
-            <w:pPr>
-              <w:spacing w:before="20" w:after="20"/>
-              <w:jc w:val="left"/>
-            </w:pPr>
-            <w:r/>
-            <w:r>
-              <w:rPr>
-                <w:rFonts w:ascii="Calibri" w:hAnsi="Calibri"/>
-                <w:sz w:val="16"/>
-              </w:rPr>
-              <w:t>ACC</w:t>
-            </w:r>
-          </w:p>
-        </w:tc>
-      </w:tr>
-      <w:tr>
-        <w:tc>
-          <w:tcPr>
-            <w:tcW w:type="dxa" w:w="340"/>
-            <w:shd w:fill="FFFFFF"/>
-          </w:tcPr>
-          <w:p>
-            <w:pPr>
-              <w:spacing w:before="20" w:after="20"/>
-              <w:jc w:val="center"/>
-            </w:pPr>
-            <w:r/>
-            <w:r>
-              <w:rPr>
-                <w:rFonts w:ascii="Calibri" w:hAnsi="Calibri"/>
-                <w:sz w:val="16"/>
-              </w:rPr>
-              <w:t>47</w:t>
-            </w:r>
-          </w:p>
-        </w:tc>
-        <w:tc>
-          <w:tcPr>
-            <w:tcW w:type="dxa" w:w="1247"/>
-            <w:shd w:fill="FFFFFF"/>
-          </w:tcPr>
-          <w:p>
-            <w:pPr>
-              <w:spacing w:before="20" w:after="20"/>
-              <w:jc w:val="left"/>
-            </w:pPr>
-            <w:r/>
-            <w:r>
-              <w:rPr>
-                <w:rFonts w:ascii="Calibri" w:hAnsi="Calibri"/>
-                <w:sz w:val="16"/>
-              </w:rPr>
-              <w:t>CARMA</w:t>
-            </w:r>
-          </w:p>
-        </w:tc>
-        <w:tc>
-          <w:tcPr>
-            <w:tcW w:type="dxa" w:w="283"/>
-            <w:shd w:fill="FFFFFF"/>
-          </w:tcPr>
-          <w:p>
-            <w:pPr>
-              <w:spacing w:before="20" w:after="20"/>
-              <w:jc w:val="center"/>
-            </w:pPr>
-            <w:r/>
-            <w:r>
-              <w:rPr>
-                <w:rFonts w:ascii="Calibri" w:hAnsi="Calibri"/>
-                <w:sz w:val="16"/>
-              </w:rPr>
-              <w:t>L</w:t>
-            </w:r>
-          </w:p>
-        </w:tc>
-        <w:tc>
-          <w:tcPr>
-            <w:tcW w:type="dxa" w:w="1020"/>
-            <w:shd w:fill="FFFFFF"/>
-          </w:tcPr>
-          <w:p>
-            <w:pPr>
-              <w:spacing w:before="20" w:after="20"/>
-              <w:jc w:val="center"/>
-            </w:pPr>
-            <w:r/>
-            <w:r>
-              <w:rPr>
-                <w:rFonts w:ascii="Calibri" w:hAnsi="Calibri"/>
-                <w:sz w:val="16"/>
-              </w:rPr>
-              <w:t>-</w:t>
-            </w:r>
-          </w:p>
-        </w:tc>
-        <w:tc>
-          <w:tcPr>
-            <w:tcW w:type="dxa" w:w="1020"/>
-            <w:shd w:fill="FFFFFF"/>
-          </w:tcPr>
-          <w:p>
-            <w:pPr>
-              <w:spacing w:before="20" w:after="20"/>
-              <w:jc w:val="center"/>
-            </w:pPr>
-            <w:r/>
-            <w:r>
-              <w:rPr>
-                <w:rFonts w:ascii="Calibri" w:hAnsi="Calibri"/>
-                <w:sz w:val="16"/>
-              </w:rPr>
-              <w:t>-</w:t>
-            </w:r>
-          </w:p>
-        </w:tc>
-        <w:tc>
-          <w:tcPr>
-            <w:tcW w:type="dxa" w:w="1587"/>
-            <w:shd w:fill="FFFFFF"/>
-          </w:tcPr>
-          <w:p>
-            <w:pPr>
-              <w:spacing w:before="20" w:after="20"/>
-              <w:jc w:val="left"/>
-            </w:pPr>
-            <w:r/>
-            <w:r>
-              <w:rPr>
-                <w:rFonts w:ascii="Calibri" w:hAnsi="Calibri"/>
-                <w:sz w:val="16"/>
-              </w:rPr>
-              <w:t>-</w:t>
-            </w:r>
-          </w:p>
-        </w:tc>
-        <w:tc>
-          <w:tcPr>
-            <w:tcW w:type="dxa" w:w="567"/>
-            <w:shd w:fill="FFFFFF"/>
-          </w:tcPr>
-          <w:p>
-            <w:pPr>
-              <w:spacing w:before="20" w:after="20"/>
-              <w:jc w:val="center"/>
-            </w:pPr>
-            <w:r/>
-            <w:r>
-              <w:rPr>
-                <w:rFonts w:ascii="Calibri" w:hAnsi="Calibri"/>
-                <w:sz w:val="16"/>
-              </w:rPr>
-              <w:t>LOA</w:t>
-            </w:r>
-          </w:p>
-        </w:tc>
-        <w:tc>
-          <w:tcPr>
-            <w:tcW w:type="dxa" w:w="567"/>
-            <w:shd w:fill="FFFFFF"/>
-          </w:tcPr>
-          <w:p>
-            <w:pPr>
-              <w:spacing w:before="20" w:after="20"/>
-              <w:jc w:val="center"/>
-            </w:pPr>
-            <w:r/>
-            <w:r>
-              <w:rPr>
-                <w:rFonts w:ascii="Calibri" w:hAnsi="Calibri"/>
-                <w:sz w:val="16"/>
-              </w:rPr>
-              <w:t>PASEH</w:t>
-            </w:r>
-          </w:p>
-        </w:tc>
-        <w:tc>
-          <w:tcPr>
-            <w:tcW w:type="dxa" w:w="1020"/>
-            <w:shd w:fill="FFFFFF"/>
-          </w:tcPr>
-          <w:p>
-            <w:pPr>
-              <w:spacing w:before="20" w:after="20"/>
-              <w:jc w:val="left"/>
-            </w:pPr>
-            <w:r/>
-            <w:r>
-              <w:rPr>
-                <w:rFonts w:ascii="Calibri" w:hAnsi="Calibri"/>
-                <w:sz w:val="16"/>
-              </w:rPr>
-              <w:t>ACC</w:t>
-            </w:r>
-          </w:p>
-        </w:tc>
-      </w:tr>
-      <w:tr>
-        <w:tc>
-          <w:tcPr>
-            <w:tcW w:type="dxa" w:w="340"/>
-            <w:shd w:fill="E7E4DF"/>
-          </w:tcPr>
-          <w:p>
-            <w:pPr>
-              <w:spacing w:before="20" w:after="20"/>
-              <w:jc w:val="center"/>
-            </w:pPr>
-            <w:r/>
-            <w:r>
-              <w:rPr>
-                <w:rFonts w:ascii="Calibri" w:hAnsi="Calibri"/>
-                <w:sz w:val="16"/>
-              </w:rPr>
-              <w:t>48</w:t>
-            </w:r>
-          </w:p>
-        </w:tc>
-        <w:tc>
-          <w:tcPr>
-            <w:tcW w:type="dxa" w:w="1247"/>
-            <w:shd w:fill="E7E4DF"/>
-          </w:tcPr>
-          <w:p>
-            <w:pPr>
-              <w:spacing w:before="20" w:after="20"/>
-              <w:jc w:val="left"/>
-            </w:pPr>
-            <w:r/>
-            <w:r>
-              <w:rPr>
-                <w:rFonts w:ascii="Calibri" w:hAnsi="Calibri"/>
-                <w:sz w:val="16"/>
-              </w:rPr>
-              <w:t>UJANG JUJUN</w:t>
-            </w:r>
-          </w:p>
-        </w:tc>
-        <w:tc>
-          <w:tcPr>
-            <w:tcW w:type="dxa" w:w="283"/>
-            <w:shd w:fill="E7E4DF"/>
-          </w:tcPr>
-          <w:p>
-            <w:pPr>
-              <w:spacing w:before="20" w:after="20"/>
-              <w:jc w:val="center"/>
-            </w:pPr>
-            <w:r/>
-            <w:r>
-              <w:rPr>
-                <w:rFonts w:ascii="Calibri" w:hAnsi="Calibri"/>
-                <w:sz w:val="16"/>
-              </w:rPr>
-              <w:t>L</w:t>
-            </w:r>
-          </w:p>
-        </w:tc>
-        <w:tc>
-          <w:tcPr>
-            <w:tcW w:type="dxa" w:w="1020"/>
-            <w:shd w:fill="E7E4DF"/>
-          </w:tcPr>
-          <w:p>
-            <w:pPr>
-              <w:spacing w:before="20" w:after="20"/>
-              <w:jc w:val="center"/>
-            </w:pPr>
-            <w:r/>
-            <w:r>
-              <w:rPr>
-                <w:rFonts w:ascii="Calibri" w:hAnsi="Calibri"/>
-                <w:sz w:val="16"/>
-              </w:rPr>
-              <w:t>-</w:t>
-            </w:r>
-          </w:p>
-        </w:tc>
-        <w:tc>
-          <w:tcPr>
-            <w:tcW w:type="dxa" w:w="1020"/>
-            <w:shd w:fill="E7E4DF"/>
-          </w:tcPr>
-          <w:p>
-            <w:pPr>
-              <w:spacing w:before="20" w:after="20"/>
-              <w:jc w:val="center"/>
-            </w:pPr>
-            <w:r/>
-            <w:r>
-              <w:rPr>
-                <w:rFonts w:ascii="Calibri" w:hAnsi="Calibri"/>
-                <w:sz w:val="16"/>
-              </w:rPr>
-              <w:t>-</w:t>
-            </w:r>
-          </w:p>
-        </w:tc>
-        <w:tc>
-          <w:tcPr>
-            <w:tcW w:type="dxa" w:w="1587"/>
-            <w:shd w:fill="E7E4DF"/>
-          </w:tcPr>
-          <w:p>
-            <w:pPr>
-              <w:spacing w:before="20" w:after="20"/>
-              <w:jc w:val="left"/>
-            </w:pPr>
-            <w:r/>
-            <w:r>
-              <w:rPr>
-                <w:rFonts w:ascii="Calibri" w:hAnsi="Calibri"/>
-                <w:sz w:val="16"/>
-              </w:rPr>
-              <w:t>-</w:t>
-            </w:r>
-          </w:p>
-        </w:tc>
-        <w:tc>
-          <w:tcPr>
-            <w:tcW w:type="dxa" w:w="567"/>
-            <w:shd w:fill="E7E4DF"/>
-          </w:tcPr>
-          <w:p>
-            <w:pPr>
-              <w:spacing w:before="20" w:after="20"/>
-              <w:jc w:val="center"/>
-            </w:pPr>
-            <w:r/>
-            <w:r>
-              <w:rPr>
-                <w:rFonts w:ascii="Calibri" w:hAnsi="Calibri"/>
-                <w:sz w:val="16"/>
-              </w:rPr>
-              <w:t>LOA</w:t>
-            </w:r>
-          </w:p>
-        </w:tc>
-        <w:tc>
-          <w:tcPr>
-            <w:tcW w:type="dxa" w:w="567"/>
-            <w:shd w:fill="E7E4DF"/>
-          </w:tcPr>
-          <w:p>
-            <w:pPr>
-              <w:spacing w:before="20" w:after="20"/>
-              <w:jc w:val="center"/>
-            </w:pPr>
-            <w:r/>
-            <w:r>
-              <w:rPr>
-                <w:rFonts w:ascii="Calibri" w:hAnsi="Calibri"/>
-                <w:sz w:val="16"/>
-              </w:rPr>
-              <w:t>PASEH</w:t>
-            </w:r>
-          </w:p>
-        </w:tc>
-        <w:tc>
-          <w:tcPr>
-            <w:tcW w:type="dxa" w:w="1020"/>
-            <w:shd w:fill="E7E4DF"/>
-          </w:tcPr>
-          <w:p>
-            <w:pPr>
-              <w:spacing w:before="20" w:after="20"/>
-              <w:jc w:val="left"/>
-            </w:pPr>
-            <w:r/>
-            <w:r>
-              <w:rPr>
-                <w:rFonts w:ascii="Calibri" w:hAnsi="Calibri"/>
-                <w:sz w:val="16"/>
-              </w:rPr>
-              <w:t>ACC</w:t>
-            </w:r>
-          </w:p>
-        </w:tc>
-      </w:tr>
-      <w:tr>
-        <w:tc>
-          <w:tcPr>
-            <w:tcW w:type="dxa" w:w="340"/>
             <w:shd w:fill="D4EDDA"/>
           </w:tcPr>
           <w:p>
@@ -9670,7 +9670,7 @@
                 <w:rFonts w:ascii="Calibri" w:hAnsi="Calibri"/>
                 <w:sz w:val="16"/>
               </w:rPr>
-              <w:t>-</w:t>
+              <w:t>3204351205570001</w:t>
             </w:r>
           </w:p>
         </w:tc>
@@ -9690,7 +9690,7 @@
                 <w:rFonts w:ascii="Calibri" w:hAnsi="Calibri"/>
                 <w:sz w:val="16"/>
               </w:rPr>
-              <w:t>-</w:t>
+              <w:t>3204351803051054</w:t>
             </w:r>
           </w:p>
         </w:tc>
@@ -9710,7 +9710,7 @@
                 <w:rFonts w:ascii="Calibri" w:hAnsi="Calibri"/>
                 <w:sz w:val="16"/>
               </w:rPr>
-              <w:t>-</w:t>
+              <w:t>KP LENGO RT 004 RW 001</w:t>
             </w:r>
           </w:p>
         </w:tc>

</xml_diff>